<commit_message>
module 4 non IT : séquence « Trouver son sujet de recherche » et chronogramme v6
- Capsule R : trouver un sujet en 5 étapes, test FINER, six types de gaps,
  articles générés par l'IA et revues prédatrices
- Lab R / Fiche R « Du domaine au gap » (10h30-11h00)
- Chronogramme recalé, grille d'évaluation rééquilibrée
- Nouveau : chronogramme complet et prérequis sur une page (docx + pdf)

Co-Authored-By: Claude Opus 5.5 <noreply@anthropic.com>
</commit_message>
<xml_diff>
--- a/module4_nonIT/M4-nonIT_Cahier_de_labs.docx
+++ b/module4_nonIT/M4-nonIT_Cahier_de_labs.docx
@@ -381,7 +381,7 @@
               </w:numPr>
             </w:pPr>
             <w:r>
-              <w:t>Une fiche par lab (Fiches 0 à 5). Remplissez-les au fil de la journée : elles constituent votre exercice évalué.</w:t>
+              <w:t>Une fiche par lab (Fiches 0, R et 1 à 5). Remplissez-les au fil de la journée : elles constituent votre exercice évalué.</w:t>
             </w:r>
           </w:p>
           <w:p>
@@ -525,7 +525,19 @@
               </w:numPr>
             </w:pPr>
             <w:r>
-              <w:t>un ordinateur portable chargé, avec vos comptes Google, Claude et Grok déjà créés ;</w:t>
+              <w:t>un ordinateur portable chargé, avec vos comptes Google, Claude, Grok, Semantic Scholar et ResearchRabbit déjà créés ;</w:t>
+            </w:r>
+          </w:p>
+          <w:p>
+            <w:pPr>
+              <w:pStyle w:val="Paragraphedeliste"/>
+              <w:numPr>
+                <w:ilvl w:val="0"/>
+                <w:numId w:val="2"/>
+              </w:numPr>
+            </w:pPr>
+            <w:r>
+              <w:t>votre thème de thèse en une phrase et un article clé de votre sujet ;</w:t>
             </w:r>
           </w:p>
           <w:p>
@@ -1383,6 +1395,7 @@
         <w:pStyle w:val="Titre2"/>
       </w:pPr>
       <w:r>
+        <w:lastRenderedPageBreak/>
         <w:t>Le RAG en 6 étapes avec Gemini Notebook</w:t>
       </w:r>
     </w:p>
@@ -1596,6 +1609,7 @@
         <w:pageBreakBefore/>
       </w:pPr>
       <w:r>
+        <w:lastRenderedPageBreak/>
         <w:t>Fiche 0 · Prise en main et piège</w:t>
       </w:r>
     </w:p>
@@ -1606,7 +1620,7 @@
           <w:iCs/>
           <w:color w:val="6B7C82"/>
         </w:rPr>
-        <w:t>Durée : 35 min · Outils : Gemini, Claude, Grok (et ChatGPT si vous voulez)</w:t>
+        <w:t>Durée : 30 min · Outils : Gemini, Claude, Grok (et ChatGPT si vous voulez)</w:t>
       </w:r>
     </w:p>
     <w:tbl>
@@ -2536,6 +2550,7 @@
         <w:pStyle w:val="Titre3"/>
       </w:pPr>
       <w:r>
+        <w:lastRenderedPageBreak/>
         <w:t>Mes 2 vraies références (Semantic Scholar)</w:t>
       </w:r>
     </w:p>
@@ -3100,7 +3115,8 @@
         <w:pageBreakBefore/>
       </w:pPr>
       <w:r>
-        <w:t>Fiche 1 · Rédaction scientifique</w:t>
+        <w:lastRenderedPageBreak/>
+        <w:t>Fiche R · Trouver son sujet : du domaine au gap</w:t>
       </w:r>
     </w:p>
     <w:p>
@@ -3110,7 +3126,7 @@
           <w:iCs/>
           <w:color w:val="6B7C82"/>
         </w:rPr>
-        <w:t>Durée : 60 min · Matériau : votre résumé de thèse ou un paragraphe de votre état de l'art · Repli : CORPUS-LABS / 0-Pack-commun / Resume_these.docx</w:t>
+        <w:t>Durée : 30 min · Outils : ResearchRabbit ou Connected Papers, Semantic Scholar, Consensus, Gemini ou Claude · Repli : thème du pack commun</w:t>
       </w:r>
     </w:p>
     <w:tbl>
@@ -3179,7 +3195,7 @@
               </w:numPr>
             </w:pPr>
             <w:r>
-              <w:t>Ouvrez votre résumé de thèse ou un paragraphe de votre état de l'art. Sans texte personnel, prenez le résumé de thèse fictif du pack commun (Resume_these.docx) : il contient des erreurs volontaires.</w:t>
+              <w:t>Écrivez votre domaine d'intérêt (ou votre thème de thèse) en une phrase. Sans idée précise, prenez le thème du pack commun : les femmes dans la recherche scientifique en Afrique.</w:t>
             </w:r>
           </w:p>
           <w:p>
@@ -3191,7 +3207,7 @@
               </w:numPr>
             </w:pPr>
             <w:r>
-              <w:t>Rédigez un prompt R-C-T-F + règles pour obtenir un résumé structuré de 250 mots (IMRaD pour un article).</w:t>
+              <w:t>Cartographiez le thème dans ResearchRabbit ou Connected Papers à partir d'un article clé : où les articles sont-ils nombreux, où sont les vides ?</w:t>
             </w:r>
           </w:p>
           <w:p>
@@ -3203,7 +3219,7 @@
               </w:numPr>
             </w:pPr>
             <w:r>
-              <w:t>Améliorez le résultat en au moins 2 itérations.</w:t>
+              <w:t>Relevez 5 articles récents dans Semantic Scholar et remplissez le tableau.</w:t>
             </w:r>
           </w:p>
           <w:p>
@@ -3215,7 +3231,7 @@
               </w:numPr>
             </w:pPr>
             <w:r>
-              <w:t>Demandez à l'IA de jouer un relecteur exigeant : relevez 3 critiques et répondez à chacune, comme à un reviewer.</w:t>
+              <w:t>Demandez à l'IA 3 gaps possibles avec le prompt ci-dessous, puis cherchez chacun dans Semantic Scholar et Google Scholar.</w:t>
             </w:r>
           </w:p>
           <w:p>
@@ -3224,6 +3240,3074 @@
               <w:numPr>
                 <w:ilvl w:val="0"/>
                 <w:numId w:val="6"/>
+              </w:numPr>
+            </w:pPr>
+            <w:r>
+              <w:t>Formulez votre question de recherche et passez-la au test FINER. Défi : analysez l'article suspect en fin de fiche.</w:t>
+            </w:r>
+          </w:p>
+        </w:tc>
+      </w:tr>
+    </w:tbl>
+    <w:p>
+      <w:pPr>
+        <w:spacing w:after="60"/>
+      </w:pPr>
+    </w:p>
+    <w:p>
+      <w:r>
+        <w:rPr>
+          <w:b/>
+          <w:bCs/>
+        </w:rPr>
+        <w:t xml:space="preserve">Mon domaine d'intérêt, en une phrase : </w:t>
+      </w:r>
+    </w:p>
+    <w:tbl>
+      <w:tblPr>
+        <w:tblW w:w="9638" w:type="dxa"/>
+        <w:tblBorders>
+          <w:top w:val="single" w:sz="4" w:space="0" w:color="auto"/>
+          <w:left w:val="single" w:sz="4" w:space="0" w:color="auto"/>
+          <w:bottom w:val="single" w:sz="4" w:space="0" w:color="auto"/>
+          <w:right w:val="single" w:sz="4" w:space="0" w:color="auto"/>
+          <w:insideH w:val="single" w:sz="4" w:space="0" w:color="auto"/>
+          <w:insideV w:val="single" w:sz="4" w:space="0" w:color="auto"/>
+        </w:tblBorders>
+        <w:tblCellMar>
+          <w:left w:w="10" w:type="dxa"/>
+          <w:right w:w="10" w:type="dxa"/>
+        </w:tblCellMar>
+        <w:tblLook w:val="04A0" w:firstRow="1" w:lastRow="0" w:firstColumn="1" w:lastColumn="0" w:noHBand="0" w:noVBand="1"/>
+      </w:tblPr>
+      <w:tblGrid>
+        <w:gridCol w:w="9638"/>
+      </w:tblGrid>
+      <w:tr>
+        <w:tblPrEx>
+          <w:tblCellMar>
+            <w:top w:w="0" w:type="dxa"/>
+            <w:bottom w:w="0" w:type="dxa"/>
+          </w:tblCellMar>
+        </w:tblPrEx>
+        <w:trPr>
+          <w:cantSplit/>
+        </w:trPr>
+        <w:tc>
+          <w:tcPr>
+            <w:tcW w:w="9638" w:type="dxa"/>
+            <w:tcBorders>
+              <w:top w:val="single" w:sz="4" w:space="0" w:color="B9C9CC"/>
+              <w:left w:val="single" w:sz="4" w:space="0" w:color="B9C9CC"/>
+              <w:bottom w:val="single" w:sz="4" w:space="0" w:color="B9C9CC"/>
+              <w:right w:val="single" w:sz="4" w:space="0" w:color="B9C9CC"/>
+            </w:tcBorders>
+            <w:tcMar>
+              <w:top w:w="80" w:type="dxa"/>
+              <w:left w:w="120" w:type="dxa"/>
+              <w:bottom w:w="80" w:type="dxa"/>
+              <w:right w:w="120" w:type="dxa"/>
+            </w:tcMar>
+          </w:tcPr>
+          <w:p/>
+          <w:p/>
+        </w:tc>
+      </w:tr>
+    </w:tbl>
+    <w:p>
+      <w:pPr>
+        <w:pStyle w:val="Titre2"/>
+      </w:pPr>
+      <w:r>
+        <w:t>Mes 5 articles récents</w:t>
+      </w:r>
+    </w:p>
+    <w:tbl>
+      <w:tblPr>
+        <w:tblW w:w="9638" w:type="dxa"/>
+        <w:tblBorders>
+          <w:top w:val="single" w:sz="4" w:space="0" w:color="auto"/>
+          <w:left w:val="single" w:sz="4" w:space="0" w:color="auto"/>
+          <w:bottom w:val="single" w:sz="4" w:space="0" w:color="auto"/>
+          <w:right w:val="single" w:sz="4" w:space="0" w:color="auto"/>
+          <w:insideH w:val="single" w:sz="4" w:space="0" w:color="auto"/>
+          <w:insideV w:val="single" w:sz="4" w:space="0" w:color="auto"/>
+        </w:tblBorders>
+        <w:tblCellMar>
+          <w:left w:w="10" w:type="dxa"/>
+          <w:right w:w="10" w:type="dxa"/>
+        </w:tblCellMar>
+        <w:tblLook w:val="04A0" w:firstRow="1" w:lastRow="0" w:firstColumn="1" w:lastColumn="0" w:noHBand="0" w:noVBand="1"/>
+      </w:tblPr>
+      <w:tblGrid>
+        <w:gridCol w:w="2900"/>
+        <w:gridCol w:w="1500"/>
+        <w:gridCol w:w="1700"/>
+        <w:gridCol w:w="1700"/>
+        <w:gridCol w:w="1838"/>
+      </w:tblGrid>
+      <w:tr>
+        <w:tblPrEx>
+          <w:tblCellMar>
+            <w:top w:w="0" w:type="dxa"/>
+            <w:bottom w:w="0" w:type="dxa"/>
+          </w:tblCellMar>
+        </w:tblPrEx>
+        <w:trPr>
+          <w:cantSplit/>
+          <w:tblHeader/>
+        </w:trPr>
+        <w:tc>
+          <w:tcPr>
+            <w:tcW w:w="2900" w:type="dxa"/>
+            <w:tcBorders>
+              <w:top w:val="single" w:sz="4" w:space="0" w:color="B9C9CC"/>
+              <w:left w:val="single" w:sz="4" w:space="0" w:color="B9C9CC"/>
+              <w:bottom w:val="single" w:sz="4" w:space="0" w:color="B9C9CC"/>
+              <w:right w:val="single" w:sz="4" w:space="0" w:color="B9C9CC"/>
+            </w:tcBorders>
+            <w:shd w:val="clear" w:color="auto" w:fill="0B3C49"/>
+            <w:tcMar>
+              <w:top w:w="80" w:type="dxa"/>
+              <w:left w:w="120" w:type="dxa"/>
+              <w:bottom w:w="80" w:type="dxa"/>
+              <w:right w:w="120" w:type="dxa"/>
+            </w:tcMar>
+          </w:tcPr>
+          <w:p>
+            <w:r>
+              <w:rPr>
+                <w:b/>
+                <w:bCs/>
+                <w:color w:val="FFFFFF"/>
+              </w:rPr>
+              <w:t>Article (auteurs, année)</w:t>
+            </w:r>
+          </w:p>
+        </w:tc>
+        <w:tc>
+          <w:tcPr>
+            <w:tcW w:w="1500" w:type="dxa"/>
+            <w:tcBorders>
+              <w:top w:val="single" w:sz="4" w:space="0" w:color="B9C9CC"/>
+              <w:left w:val="single" w:sz="4" w:space="0" w:color="B9C9CC"/>
+              <w:bottom w:val="single" w:sz="4" w:space="0" w:color="B9C9CC"/>
+              <w:right w:val="single" w:sz="4" w:space="0" w:color="B9C9CC"/>
+            </w:tcBorders>
+            <w:shd w:val="clear" w:color="auto" w:fill="0B3C49"/>
+            <w:tcMar>
+              <w:top w:w="80" w:type="dxa"/>
+              <w:left w:w="120" w:type="dxa"/>
+              <w:bottom w:w="80" w:type="dxa"/>
+              <w:right w:w="120" w:type="dxa"/>
+            </w:tcMar>
+          </w:tcPr>
+          <w:p>
+            <w:r>
+              <w:rPr>
+                <w:b/>
+                <w:bCs/>
+                <w:color w:val="FFFFFF"/>
+              </w:rPr>
+              <w:t>Pays, contexte</w:t>
+            </w:r>
+          </w:p>
+        </w:tc>
+        <w:tc>
+          <w:tcPr>
+            <w:tcW w:w="1700" w:type="dxa"/>
+            <w:tcBorders>
+              <w:top w:val="single" w:sz="4" w:space="0" w:color="B9C9CC"/>
+              <w:left w:val="single" w:sz="4" w:space="0" w:color="B9C9CC"/>
+              <w:bottom w:val="single" w:sz="4" w:space="0" w:color="B9C9CC"/>
+              <w:right w:val="single" w:sz="4" w:space="0" w:color="B9C9CC"/>
+            </w:tcBorders>
+            <w:shd w:val="clear" w:color="auto" w:fill="0B3C49"/>
+            <w:tcMar>
+              <w:top w:w="80" w:type="dxa"/>
+              <w:left w:w="120" w:type="dxa"/>
+              <w:bottom w:w="80" w:type="dxa"/>
+              <w:right w:w="120" w:type="dxa"/>
+            </w:tcMar>
+          </w:tcPr>
+          <w:p>
+            <w:r>
+              <w:rPr>
+                <w:b/>
+                <w:bCs/>
+                <w:color w:val="FFFFFF"/>
+              </w:rPr>
+              <w:t>Population</w:t>
+            </w:r>
+          </w:p>
+        </w:tc>
+        <w:tc>
+          <w:tcPr>
+            <w:tcW w:w="1700" w:type="dxa"/>
+            <w:tcBorders>
+              <w:top w:val="single" w:sz="4" w:space="0" w:color="B9C9CC"/>
+              <w:left w:val="single" w:sz="4" w:space="0" w:color="B9C9CC"/>
+              <w:bottom w:val="single" w:sz="4" w:space="0" w:color="B9C9CC"/>
+              <w:right w:val="single" w:sz="4" w:space="0" w:color="B9C9CC"/>
+            </w:tcBorders>
+            <w:shd w:val="clear" w:color="auto" w:fill="0B3C49"/>
+            <w:tcMar>
+              <w:top w:w="80" w:type="dxa"/>
+              <w:left w:w="120" w:type="dxa"/>
+              <w:bottom w:w="80" w:type="dxa"/>
+              <w:right w:w="120" w:type="dxa"/>
+            </w:tcMar>
+          </w:tcPr>
+          <w:p>
+            <w:r>
+              <w:rPr>
+                <w:b/>
+                <w:bCs/>
+                <w:color w:val="FFFFFF"/>
+              </w:rPr>
+              <w:t>Méthode</w:t>
+            </w:r>
+          </w:p>
+        </w:tc>
+        <w:tc>
+          <w:tcPr>
+            <w:tcW w:w="1838" w:type="dxa"/>
+            <w:tcBorders>
+              <w:top w:val="single" w:sz="4" w:space="0" w:color="B9C9CC"/>
+              <w:left w:val="single" w:sz="4" w:space="0" w:color="B9C9CC"/>
+              <w:bottom w:val="single" w:sz="4" w:space="0" w:color="B9C9CC"/>
+              <w:right w:val="single" w:sz="4" w:space="0" w:color="B9C9CC"/>
+            </w:tcBorders>
+            <w:shd w:val="clear" w:color="auto" w:fill="0B3C49"/>
+            <w:tcMar>
+              <w:top w:w="80" w:type="dxa"/>
+              <w:left w:w="120" w:type="dxa"/>
+              <w:bottom w:w="80" w:type="dxa"/>
+              <w:right w:w="120" w:type="dxa"/>
+            </w:tcMar>
+          </w:tcPr>
+          <w:p>
+            <w:r>
+              <w:rPr>
+                <w:b/>
+                <w:bCs/>
+                <w:color w:val="FFFFFF"/>
+              </w:rPr>
+              <w:t>Limite annoncée par les auteurs</w:t>
+            </w:r>
+          </w:p>
+        </w:tc>
+      </w:tr>
+      <w:tr>
+        <w:tblPrEx>
+          <w:tblCellMar>
+            <w:top w:w="0" w:type="dxa"/>
+            <w:bottom w:w="0" w:type="dxa"/>
+          </w:tblCellMar>
+        </w:tblPrEx>
+        <w:trPr>
+          <w:cantSplit/>
+          <w:trHeight w:val="560"/>
+        </w:trPr>
+        <w:tc>
+          <w:tcPr>
+            <w:tcW w:w="2900" w:type="dxa"/>
+            <w:tcBorders>
+              <w:top w:val="single" w:sz="4" w:space="0" w:color="B9C9CC"/>
+              <w:left w:val="single" w:sz="4" w:space="0" w:color="B9C9CC"/>
+              <w:bottom w:val="single" w:sz="4" w:space="0" w:color="B9C9CC"/>
+              <w:right w:val="single" w:sz="4" w:space="0" w:color="B9C9CC"/>
+            </w:tcBorders>
+            <w:shd w:val="clear" w:color="auto" w:fill="EAF3F2"/>
+            <w:tcMar>
+              <w:top w:w="80" w:type="dxa"/>
+              <w:left w:w="120" w:type="dxa"/>
+              <w:bottom w:w="80" w:type="dxa"/>
+              <w:right w:w="120" w:type="dxa"/>
+            </w:tcMar>
+          </w:tcPr>
+          <w:p>
+            <w:r>
+              <w:rPr>
+                <w:b/>
+                <w:bCs/>
+              </w:rPr>
+              <w:t>1.</w:t>
+            </w:r>
+          </w:p>
+        </w:tc>
+        <w:tc>
+          <w:tcPr>
+            <w:tcW w:w="1500" w:type="dxa"/>
+            <w:tcBorders>
+              <w:top w:val="single" w:sz="4" w:space="0" w:color="B9C9CC"/>
+              <w:left w:val="single" w:sz="4" w:space="0" w:color="B9C9CC"/>
+              <w:bottom w:val="single" w:sz="4" w:space="0" w:color="B9C9CC"/>
+              <w:right w:val="single" w:sz="4" w:space="0" w:color="B9C9CC"/>
+            </w:tcBorders>
+            <w:tcMar>
+              <w:top w:w="80" w:type="dxa"/>
+              <w:left w:w="120" w:type="dxa"/>
+              <w:bottom w:w="80" w:type="dxa"/>
+              <w:right w:w="120" w:type="dxa"/>
+            </w:tcMar>
+          </w:tcPr>
+          <w:p/>
+        </w:tc>
+        <w:tc>
+          <w:tcPr>
+            <w:tcW w:w="1700" w:type="dxa"/>
+            <w:tcBorders>
+              <w:top w:val="single" w:sz="4" w:space="0" w:color="B9C9CC"/>
+              <w:left w:val="single" w:sz="4" w:space="0" w:color="B9C9CC"/>
+              <w:bottom w:val="single" w:sz="4" w:space="0" w:color="B9C9CC"/>
+              <w:right w:val="single" w:sz="4" w:space="0" w:color="B9C9CC"/>
+            </w:tcBorders>
+            <w:tcMar>
+              <w:top w:w="80" w:type="dxa"/>
+              <w:left w:w="120" w:type="dxa"/>
+              <w:bottom w:w="80" w:type="dxa"/>
+              <w:right w:w="120" w:type="dxa"/>
+            </w:tcMar>
+          </w:tcPr>
+          <w:p/>
+        </w:tc>
+        <w:tc>
+          <w:tcPr>
+            <w:tcW w:w="1700" w:type="dxa"/>
+            <w:tcBorders>
+              <w:top w:val="single" w:sz="4" w:space="0" w:color="B9C9CC"/>
+              <w:left w:val="single" w:sz="4" w:space="0" w:color="B9C9CC"/>
+              <w:bottom w:val="single" w:sz="4" w:space="0" w:color="B9C9CC"/>
+              <w:right w:val="single" w:sz="4" w:space="0" w:color="B9C9CC"/>
+            </w:tcBorders>
+            <w:tcMar>
+              <w:top w:w="80" w:type="dxa"/>
+              <w:left w:w="120" w:type="dxa"/>
+              <w:bottom w:w="80" w:type="dxa"/>
+              <w:right w:w="120" w:type="dxa"/>
+            </w:tcMar>
+          </w:tcPr>
+          <w:p/>
+        </w:tc>
+        <w:tc>
+          <w:tcPr>
+            <w:tcW w:w="1838" w:type="dxa"/>
+            <w:tcBorders>
+              <w:top w:val="single" w:sz="4" w:space="0" w:color="B9C9CC"/>
+              <w:left w:val="single" w:sz="4" w:space="0" w:color="B9C9CC"/>
+              <w:bottom w:val="single" w:sz="4" w:space="0" w:color="B9C9CC"/>
+              <w:right w:val="single" w:sz="4" w:space="0" w:color="B9C9CC"/>
+            </w:tcBorders>
+            <w:tcMar>
+              <w:top w:w="80" w:type="dxa"/>
+              <w:left w:w="120" w:type="dxa"/>
+              <w:bottom w:w="80" w:type="dxa"/>
+              <w:right w:w="120" w:type="dxa"/>
+            </w:tcMar>
+          </w:tcPr>
+          <w:p/>
+        </w:tc>
+      </w:tr>
+      <w:tr>
+        <w:tblPrEx>
+          <w:tblCellMar>
+            <w:top w:w="0" w:type="dxa"/>
+            <w:bottom w:w="0" w:type="dxa"/>
+          </w:tblCellMar>
+        </w:tblPrEx>
+        <w:trPr>
+          <w:cantSplit/>
+          <w:trHeight w:val="560"/>
+        </w:trPr>
+        <w:tc>
+          <w:tcPr>
+            <w:tcW w:w="2900" w:type="dxa"/>
+            <w:tcBorders>
+              <w:top w:val="single" w:sz="4" w:space="0" w:color="B9C9CC"/>
+              <w:left w:val="single" w:sz="4" w:space="0" w:color="B9C9CC"/>
+              <w:bottom w:val="single" w:sz="4" w:space="0" w:color="B9C9CC"/>
+              <w:right w:val="single" w:sz="4" w:space="0" w:color="B9C9CC"/>
+            </w:tcBorders>
+            <w:shd w:val="clear" w:color="auto" w:fill="EAF3F2"/>
+            <w:tcMar>
+              <w:top w:w="80" w:type="dxa"/>
+              <w:left w:w="120" w:type="dxa"/>
+              <w:bottom w:w="80" w:type="dxa"/>
+              <w:right w:w="120" w:type="dxa"/>
+            </w:tcMar>
+          </w:tcPr>
+          <w:p>
+            <w:r>
+              <w:rPr>
+                <w:b/>
+                <w:bCs/>
+              </w:rPr>
+              <w:t>2.</w:t>
+            </w:r>
+          </w:p>
+        </w:tc>
+        <w:tc>
+          <w:tcPr>
+            <w:tcW w:w="1500" w:type="dxa"/>
+            <w:tcBorders>
+              <w:top w:val="single" w:sz="4" w:space="0" w:color="B9C9CC"/>
+              <w:left w:val="single" w:sz="4" w:space="0" w:color="B9C9CC"/>
+              <w:bottom w:val="single" w:sz="4" w:space="0" w:color="B9C9CC"/>
+              <w:right w:val="single" w:sz="4" w:space="0" w:color="B9C9CC"/>
+            </w:tcBorders>
+            <w:tcMar>
+              <w:top w:w="80" w:type="dxa"/>
+              <w:left w:w="120" w:type="dxa"/>
+              <w:bottom w:w="80" w:type="dxa"/>
+              <w:right w:w="120" w:type="dxa"/>
+            </w:tcMar>
+          </w:tcPr>
+          <w:p/>
+        </w:tc>
+        <w:tc>
+          <w:tcPr>
+            <w:tcW w:w="1700" w:type="dxa"/>
+            <w:tcBorders>
+              <w:top w:val="single" w:sz="4" w:space="0" w:color="B9C9CC"/>
+              <w:left w:val="single" w:sz="4" w:space="0" w:color="B9C9CC"/>
+              <w:bottom w:val="single" w:sz="4" w:space="0" w:color="B9C9CC"/>
+              <w:right w:val="single" w:sz="4" w:space="0" w:color="B9C9CC"/>
+            </w:tcBorders>
+            <w:tcMar>
+              <w:top w:w="80" w:type="dxa"/>
+              <w:left w:w="120" w:type="dxa"/>
+              <w:bottom w:w="80" w:type="dxa"/>
+              <w:right w:w="120" w:type="dxa"/>
+            </w:tcMar>
+          </w:tcPr>
+          <w:p/>
+        </w:tc>
+        <w:tc>
+          <w:tcPr>
+            <w:tcW w:w="1700" w:type="dxa"/>
+            <w:tcBorders>
+              <w:top w:val="single" w:sz="4" w:space="0" w:color="B9C9CC"/>
+              <w:left w:val="single" w:sz="4" w:space="0" w:color="B9C9CC"/>
+              <w:bottom w:val="single" w:sz="4" w:space="0" w:color="B9C9CC"/>
+              <w:right w:val="single" w:sz="4" w:space="0" w:color="B9C9CC"/>
+            </w:tcBorders>
+            <w:tcMar>
+              <w:top w:w="80" w:type="dxa"/>
+              <w:left w:w="120" w:type="dxa"/>
+              <w:bottom w:w="80" w:type="dxa"/>
+              <w:right w:w="120" w:type="dxa"/>
+            </w:tcMar>
+          </w:tcPr>
+          <w:p/>
+        </w:tc>
+        <w:tc>
+          <w:tcPr>
+            <w:tcW w:w="1838" w:type="dxa"/>
+            <w:tcBorders>
+              <w:top w:val="single" w:sz="4" w:space="0" w:color="B9C9CC"/>
+              <w:left w:val="single" w:sz="4" w:space="0" w:color="B9C9CC"/>
+              <w:bottom w:val="single" w:sz="4" w:space="0" w:color="B9C9CC"/>
+              <w:right w:val="single" w:sz="4" w:space="0" w:color="B9C9CC"/>
+            </w:tcBorders>
+            <w:tcMar>
+              <w:top w:w="80" w:type="dxa"/>
+              <w:left w:w="120" w:type="dxa"/>
+              <w:bottom w:w="80" w:type="dxa"/>
+              <w:right w:w="120" w:type="dxa"/>
+            </w:tcMar>
+          </w:tcPr>
+          <w:p/>
+        </w:tc>
+      </w:tr>
+      <w:tr>
+        <w:tblPrEx>
+          <w:tblCellMar>
+            <w:top w:w="0" w:type="dxa"/>
+            <w:bottom w:w="0" w:type="dxa"/>
+          </w:tblCellMar>
+        </w:tblPrEx>
+        <w:trPr>
+          <w:cantSplit/>
+          <w:trHeight w:val="560"/>
+        </w:trPr>
+        <w:tc>
+          <w:tcPr>
+            <w:tcW w:w="2900" w:type="dxa"/>
+            <w:tcBorders>
+              <w:top w:val="single" w:sz="4" w:space="0" w:color="B9C9CC"/>
+              <w:left w:val="single" w:sz="4" w:space="0" w:color="B9C9CC"/>
+              <w:bottom w:val="single" w:sz="4" w:space="0" w:color="B9C9CC"/>
+              <w:right w:val="single" w:sz="4" w:space="0" w:color="B9C9CC"/>
+            </w:tcBorders>
+            <w:shd w:val="clear" w:color="auto" w:fill="EAF3F2"/>
+            <w:tcMar>
+              <w:top w:w="80" w:type="dxa"/>
+              <w:left w:w="120" w:type="dxa"/>
+              <w:bottom w:w="80" w:type="dxa"/>
+              <w:right w:w="120" w:type="dxa"/>
+            </w:tcMar>
+          </w:tcPr>
+          <w:p>
+            <w:r>
+              <w:rPr>
+                <w:b/>
+                <w:bCs/>
+              </w:rPr>
+              <w:t>3.</w:t>
+            </w:r>
+          </w:p>
+        </w:tc>
+        <w:tc>
+          <w:tcPr>
+            <w:tcW w:w="1500" w:type="dxa"/>
+            <w:tcBorders>
+              <w:top w:val="single" w:sz="4" w:space="0" w:color="B9C9CC"/>
+              <w:left w:val="single" w:sz="4" w:space="0" w:color="B9C9CC"/>
+              <w:bottom w:val="single" w:sz="4" w:space="0" w:color="B9C9CC"/>
+              <w:right w:val="single" w:sz="4" w:space="0" w:color="B9C9CC"/>
+            </w:tcBorders>
+            <w:tcMar>
+              <w:top w:w="80" w:type="dxa"/>
+              <w:left w:w="120" w:type="dxa"/>
+              <w:bottom w:w="80" w:type="dxa"/>
+              <w:right w:w="120" w:type="dxa"/>
+            </w:tcMar>
+          </w:tcPr>
+          <w:p/>
+        </w:tc>
+        <w:tc>
+          <w:tcPr>
+            <w:tcW w:w="1700" w:type="dxa"/>
+            <w:tcBorders>
+              <w:top w:val="single" w:sz="4" w:space="0" w:color="B9C9CC"/>
+              <w:left w:val="single" w:sz="4" w:space="0" w:color="B9C9CC"/>
+              <w:bottom w:val="single" w:sz="4" w:space="0" w:color="B9C9CC"/>
+              <w:right w:val="single" w:sz="4" w:space="0" w:color="B9C9CC"/>
+            </w:tcBorders>
+            <w:tcMar>
+              <w:top w:w="80" w:type="dxa"/>
+              <w:left w:w="120" w:type="dxa"/>
+              <w:bottom w:w="80" w:type="dxa"/>
+              <w:right w:w="120" w:type="dxa"/>
+            </w:tcMar>
+          </w:tcPr>
+          <w:p/>
+        </w:tc>
+        <w:tc>
+          <w:tcPr>
+            <w:tcW w:w="1700" w:type="dxa"/>
+            <w:tcBorders>
+              <w:top w:val="single" w:sz="4" w:space="0" w:color="B9C9CC"/>
+              <w:left w:val="single" w:sz="4" w:space="0" w:color="B9C9CC"/>
+              <w:bottom w:val="single" w:sz="4" w:space="0" w:color="B9C9CC"/>
+              <w:right w:val="single" w:sz="4" w:space="0" w:color="B9C9CC"/>
+            </w:tcBorders>
+            <w:tcMar>
+              <w:top w:w="80" w:type="dxa"/>
+              <w:left w:w="120" w:type="dxa"/>
+              <w:bottom w:w="80" w:type="dxa"/>
+              <w:right w:w="120" w:type="dxa"/>
+            </w:tcMar>
+          </w:tcPr>
+          <w:p/>
+        </w:tc>
+        <w:tc>
+          <w:tcPr>
+            <w:tcW w:w="1838" w:type="dxa"/>
+            <w:tcBorders>
+              <w:top w:val="single" w:sz="4" w:space="0" w:color="B9C9CC"/>
+              <w:left w:val="single" w:sz="4" w:space="0" w:color="B9C9CC"/>
+              <w:bottom w:val="single" w:sz="4" w:space="0" w:color="B9C9CC"/>
+              <w:right w:val="single" w:sz="4" w:space="0" w:color="B9C9CC"/>
+            </w:tcBorders>
+            <w:tcMar>
+              <w:top w:w="80" w:type="dxa"/>
+              <w:left w:w="120" w:type="dxa"/>
+              <w:bottom w:w="80" w:type="dxa"/>
+              <w:right w:w="120" w:type="dxa"/>
+            </w:tcMar>
+          </w:tcPr>
+          <w:p/>
+        </w:tc>
+      </w:tr>
+      <w:tr>
+        <w:tblPrEx>
+          <w:tblCellMar>
+            <w:top w:w="0" w:type="dxa"/>
+            <w:bottom w:w="0" w:type="dxa"/>
+          </w:tblCellMar>
+        </w:tblPrEx>
+        <w:trPr>
+          <w:cantSplit/>
+          <w:trHeight w:val="560"/>
+        </w:trPr>
+        <w:tc>
+          <w:tcPr>
+            <w:tcW w:w="2900" w:type="dxa"/>
+            <w:tcBorders>
+              <w:top w:val="single" w:sz="4" w:space="0" w:color="B9C9CC"/>
+              <w:left w:val="single" w:sz="4" w:space="0" w:color="B9C9CC"/>
+              <w:bottom w:val="single" w:sz="4" w:space="0" w:color="B9C9CC"/>
+              <w:right w:val="single" w:sz="4" w:space="0" w:color="B9C9CC"/>
+            </w:tcBorders>
+            <w:shd w:val="clear" w:color="auto" w:fill="EAF3F2"/>
+            <w:tcMar>
+              <w:top w:w="80" w:type="dxa"/>
+              <w:left w:w="120" w:type="dxa"/>
+              <w:bottom w:w="80" w:type="dxa"/>
+              <w:right w:w="120" w:type="dxa"/>
+            </w:tcMar>
+          </w:tcPr>
+          <w:p>
+            <w:r>
+              <w:rPr>
+                <w:b/>
+                <w:bCs/>
+              </w:rPr>
+              <w:t>4.</w:t>
+            </w:r>
+          </w:p>
+        </w:tc>
+        <w:tc>
+          <w:tcPr>
+            <w:tcW w:w="1500" w:type="dxa"/>
+            <w:tcBorders>
+              <w:top w:val="single" w:sz="4" w:space="0" w:color="B9C9CC"/>
+              <w:left w:val="single" w:sz="4" w:space="0" w:color="B9C9CC"/>
+              <w:bottom w:val="single" w:sz="4" w:space="0" w:color="B9C9CC"/>
+              <w:right w:val="single" w:sz="4" w:space="0" w:color="B9C9CC"/>
+            </w:tcBorders>
+            <w:tcMar>
+              <w:top w:w="80" w:type="dxa"/>
+              <w:left w:w="120" w:type="dxa"/>
+              <w:bottom w:w="80" w:type="dxa"/>
+              <w:right w:w="120" w:type="dxa"/>
+            </w:tcMar>
+          </w:tcPr>
+          <w:p/>
+        </w:tc>
+        <w:tc>
+          <w:tcPr>
+            <w:tcW w:w="1700" w:type="dxa"/>
+            <w:tcBorders>
+              <w:top w:val="single" w:sz="4" w:space="0" w:color="B9C9CC"/>
+              <w:left w:val="single" w:sz="4" w:space="0" w:color="B9C9CC"/>
+              <w:bottom w:val="single" w:sz="4" w:space="0" w:color="B9C9CC"/>
+              <w:right w:val="single" w:sz="4" w:space="0" w:color="B9C9CC"/>
+            </w:tcBorders>
+            <w:tcMar>
+              <w:top w:w="80" w:type="dxa"/>
+              <w:left w:w="120" w:type="dxa"/>
+              <w:bottom w:w="80" w:type="dxa"/>
+              <w:right w:w="120" w:type="dxa"/>
+            </w:tcMar>
+          </w:tcPr>
+          <w:p/>
+        </w:tc>
+        <w:tc>
+          <w:tcPr>
+            <w:tcW w:w="1700" w:type="dxa"/>
+            <w:tcBorders>
+              <w:top w:val="single" w:sz="4" w:space="0" w:color="B9C9CC"/>
+              <w:left w:val="single" w:sz="4" w:space="0" w:color="B9C9CC"/>
+              <w:bottom w:val="single" w:sz="4" w:space="0" w:color="B9C9CC"/>
+              <w:right w:val="single" w:sz="4" w:space="0" w:color="B9C9CC"/>
+            </w:tcBorders>
+            <w:tcMar>
+              <w:top w:w="80" w:type="dxa"/>
+              <w:left w:w="120" w:type="dxa"/>
+              <w:bottom w:w="80" w:type="dxa"/>
+              <w:right w:w="120" w:type="dxa"/>
+            </w:tcMar>
+          </w:tcPr>
+          <w:p/>
+        </w:tc>
+        <w:tc>
+          <w:tcPr>
+            <w:tcW w:w="1838" w:type="dxa"/>
+            <w:tcBorders>
+              <w:top w:val="single" w:sz="4" w:space="0" w:color="B9C9CC"/>
+              <w:left w:val="single" w:sz="4" w:space="0" w:color="B9C9CC"/>
+              <w:bottom w:val="single" w:sz="4" w:space="0" w:color="B9C9CC"/>
+              <w:right w:val="single" w:sz="4" w:space="0" w:color="B9C9CC"/>
+            </w:tcBorders>
+            <w:tcMar>
+              <w:top w:w="80" w:type="dxa"/>
+              <w:left w:w="120" w:type="dxa"/>
+              <w:bottom w:w="80" w:type="dxa"/>
+              <w:right w:w="120" w:type="dxa"/>
+            </w:tcMar>
+          </w:tcPr>
+          <w:p/>
+        </w:tc>
+      </w:tr>
+      <w:tr>
+        <w:tblPrEx>
+          <w:tblCellMar>
+            <w:top w:w="0" w:type="dxa"/>
+            <w:bottom w:w="0" w:type="dxa"/>
+          </w:tblCellMar>
+        </w:tblPrEx>
+        <w:trPr>
+          <w:cantSplit/>
+          <w:trHeight w:val="560"/>
+        </w:trPr>
+        <w:tc>
+          <w:tcPr>
+            <w:tcW w:w="2900" w:type="dxa"/>
+            <w:tcBorders>
+              <w:top w:val="single" w:sz="4" w:space="0" w:color="B9C9CC"/>
+              <w:left w:val="single" w:sz="4" w:space="0" w:color="B9C9CC"/>
+              <w:bottom w:val="single" w:sz="4" w:space="0" w:color="B9C9CC"/>
+              <w:right w:val="single" w:sz="4" w:space="0" w:color="B9C9CC"/>
+            </w:tcBorders>
+            <w:shd w:val="clear" w:color="auto" w:fill="EAF3F2"/>
+            <w:tcMar>
+              <w:top w:w="80" w:type="dxa"/>
+              <w:left w:w="120" w:type="dxa"/>
+              <w:bottom w:w="80" w:type="dxa"/>
+              <w:right w:w="120" w:type="dxa"/>
+            </w:tcMar>
+          </w:tcPr>
+          <w:p>
+            <w:r>
+              <w:rPr>
+                <w:b/>
+                <w:bCs/>
+              </w:rPr>
+              <w:t>5.</w:t>
+            </w:r>
+          </w:p>
+        </w:tc>
+        <w:tc>
+          <w:tcPr>
+            <w:tcW w:w="1500" w:type="dxa"/>
+            <w:tcBorders>
+              <w:top w:val="single" w:sz="4" w:space="0" w:color="B9C9CC"/>
+              <w:left w:val="single" w:sz="4" w:space="0" w:color="B9C9CC"/>
+              <w:bottom w:val="single" w:sz="4" w:space="0" w:color="B9C9CC"/>
+              <w:right w:val="single" w:sz="4" w:space="0" w:color="B9C9CC"/>
+            </w:tcBorders>
+            <w:tcMar>
+              <w:top w:w="80" w:type="dxa"/>
+              <w:left w:w="120" w:type="dxa"/>
+              <w:bottom w:w="80" w:type="dxa"/>
+              <w:right w:w="120" w:type="dxa"/>
+            </w:tcMar>
+          </w:tcPr>
+          <w:p/>
+        </w:tc>
+        <w:tc>
+          <w:tcPr>
+            <w:tcW w:w="1700" w:type="dxa"/>
+            <w:tcBorders>
+              <w:top w:val="single" w:sz="4" w:space="0" w:color="B9C9CC"/>
+              <w:left w:val="single" w:sz="4" w:space="0" w:color="B9C9CC"/>
+              <w:bottom w:val="single" w:sz="4" w:space="0" w:color="B9C9CC"/>
+              <w:right w:val="single" w:sz="4" w:space="0" w:color="B9C9CC"/>
+            </w:tcBorders>
+            <w:tcMar>
+              <w:top w:w="80" w:type="dxa"/>
+              <w:left w:w="120" w:type="dxa"/>
+              <w:bottom w:w="80" w:type="dxa"/>
+              <w:right w:w="120" w:type="dxa"/>
+            </w:tcMar>
+          </w:tcPr>
+          <w:p/>
+        </w:tc>
+        <w:tc>
+          <w:tcPr>
+            <w:tcW w:w="1700" w:type="dxa"/>
+            <w:tcBorders>
+              <w:top w:val="single" w:sz="4" w:space="0" w:color="B9C9CC"/>
+              <w:left w:val="single" w:sz="4" w:space="0" w:color="B9C9CC"/>
+              <w:bottom w:val="single" w:sz="4" w:space="0" w:color="B9C9CC"/>
+              <w:right w:val="single" w:sz="4" w:space="0" w:color="B9C9CC"/>
+            </w:tcBorders>
+            <w:tcMar>
+              <w:top w:w="80" w:type="dxa"/>
+              <w:left w:w="120" w:type="dxa"/>
+              <w:bottom w:w="80" w:type="dxa"/>
+              <w:right w:w="120" w:type="dxa"/>
+            </w:tcMar>
+          </w:tcPr>
+          <w:p/>
+        </w:tc>
+        <w:tc>
+          <w:tcPr>
+            <w:tcW w:w="1838" w:type="dxa"/>
+            <w:tcBorders>
+              <w:top w:val="single" w:sz="4" w:space="0" w:color="B9C9CC"/>
+              <w:left w:val="single" w:sz="4" w:space="0" w:color="B9C9CC"/>
+              <w:bottom w:val="single" w:sz="4" w:space="0" w:color="B9C9CC"/>
+              <w:right w:val="single" w:sz="4" w:space="0" w:color="B9C9CC"/>
+            </w:tcBorders>
+            <w:tcMar>
+              <w:top w:w="80" w:type="dxa"/>
+              <w:left w:w="120" w:type="dxa"/>
+              <w:bottom w:w="80" w:type="dxa"/>
+              <w:right w:w="120" w:type="dxa"/>
+            </w:tcMar>
+          </w:tcPr>
+          <w:p/>
+        </w:tc>
+      </w:tr>
+    </w:tbl>
+    <w:p>
+      <w:pPr>
+        <w:pStyle w:val="Titre3"/>
+      </w:pPr>
+      <w:r>
+        <w:lastRenderedPageBreak/>
+        <w:t>Ce que montre la carte (ResearchRabbit ou Connected Papers)</w:t>
+      </w:r>
+    </w:p>
+    <w:tbl>
+      <w:tblPr>
+        <w:tblW w:w="9638" w:type="dxa"/>
+        <w:tblBorders>
+          <w:top w:val="single" w:sz="4" w:space="0" w:color="auto"/>
+          <w:left w:val="single" w:sz="4" w:space="0" w:color="auto"/>
+          <w:bottom w:val="single" w:sz="4" w:space="0" w:color="auto"/>
+          <w:right w:val="single" w:sz="4" w:space="0" w:color="auto"/>
+          <w:insideH w:val="single" w:sz="4" w:space="0" w:color="auto"/>
+          <w:insideV w:val="single" w:sz="4" w:space="0" w:color="auto"/>
+        </w:tblBorders>
+        <w:tblCellMar>
+          <w:left w:w="10" w:type="dxa"/>
+          <w:right w:w="10" w:type="dxa"/>
+        </w:tblCellMar>
+        <w:tblLook w:val="04A0" w:firstRow="1" w:lastRow="0" w:firstColumn="1" w:lastColumn="0" w:noHBand="0" w:noVBand="1"/>
+      </w:tblPr>
+      <w:tblGrid>
+        <w:gridCol w:w="9638"/>
+      </w:tblGrid>
+      <w:tr>
+        <w:tblPrEx>
+          <w:tblCellMar>
+            <w:top w:w="0" w:type="dxa"/>
+            <w:bottom w:w="0" w:type="dxa"/>
+          </w:tblCellMar>
+        </w:tblPrEx>
+        <w:trPr>
+          <w:cantSplit/>
+        </w:trPr>
+        <w:tc>
+          <w:tcPr>
+            <w:tcW w:w="9638" w:type="dxa"/>
+            <w:tcBorders>
+              <w:top w:val="single" w:sz="4" w:space="0" w:color="B9C9CC"/>
+              <w:left w:val="single" w:sz="4" w:space="0" w:color="B9C9CC"/>
+              <w:bottom w:val="single" w:sz="4" w:space="0" w:color="B9C9CC"/>
+              <w:right w:val="single" w:sz="4" w:space="0" w:color="B9C9CC"/>
+            </w:tcBorders>
+            <w:tcMar>
+              <w:top w:w="80" w:type="dxa"/>
+              <w:left w:w="120" w:type="dxa"/>
+              <w:bottom w:w="80" w:type="dxa"/>
+              <w:right w:w="120" w:type="dxa"/>
+            </w:tcMar>
+          </w:tcPr>
+          <w:p/>
+          <w:p/>
+        </w:tc>
+      </w:tr>
+    </w:tbl>
+    <w:p>
+      <w:pPr>
+        <w:pStyle w:val="Titre2"/>
+      </w:pPr>
+      <w:r>
+        <w:t>Prompt à copier</w:t>
+      </w:r>
+    </w:p>
+    <w:tbl>
+      <w:tblPr>
+        <w:tblW w:w="9638" w:type="dxa"/>
+        <w:tblBorders>
+          <w:top w:val="single" w:sz="4" w:space="0" w:color="auto"/>
+          <w:left w:val="single" w:sz="4" w:space="0" w:color="auto"/>
+          <w:bottom w:val="single" w:sz="4" w:space="0" w:color="auto"/>
+          <w:right w:val="single" w:sz="4" w:space="0" w:color="auto"/>
+          <w:insideH w:val="single" w:sz="4" w:space="0" w:color="auto"/>
+          <w:insideV w:val="single" w:sz="4" w:space="0" w:color="auto"/>
+        </w:tblBorders>
+        <w:tblCellMar>
+          <w:left w:w="10" w:type="dxa"/>
+          <w:right w:w="10" w:type="dxa"/>
+        </w:tblCellMar>
+        <w:tblLook w:val="04A0" w:firstRow="1" w:lastRow="0" w:firstColumn="1" w:lastColumn="0" w:noHBand="0" w:noVBand="1"/>
+      </w:tblPr>
+      <w:tblGrid>
+        <w:gridCol w:w="9638"/>
+      </w:tblGrid>
+      <w:tr>
+        <w:tblPrEx>
+          <w:tblCellMar>
+            <w:top w:w="0" w:type="dxa"/>
+            <w:bottom w:w="0" w:type="dxa"/>
+          </w:tblCellMar>
+        </w:tblPrEx>
+        <w:trPr>
+          <w:cantSplit/>
+        </w:trPr>
+        <w:tc>
+          <w:tcPr>
+            <w:tcW w:w="9638" w:type="dxa"/>
+            <w:tcBorders>
+              <w:top w:val="none" w:sz="0" w:space="0" w:color="FFFFFF"/>
+              <w:left w:val="none" w:sz="0" w:space="0" w:color="FFFFFF"/>
+              <w:bottom w:val="none" w:sz="0" w:space="0" w:color="FFFFFF"/>
+              <w:right w:val="none" w:sz="0" w:space="0" w:color="FFFFFF"/>
+            </w:tcBorders>
+            <w:shd w:val="clear" w:color="auto" w:fill="F4F7F7"/>
+            <w:tcMar>
+              <w:top w:w="140" w:type="dxa"/>
+              <w:left w:w="200" w:type="dxa"/>
+              <w:bottom w:w="140" w:type="dxa"/>
+              <w:right w:w="200" w:type="dxa"/>
+            </w:tcMar>
+          </w:tcPr>
+          <w:p>
+            <w:r>
+              <w:rPr>
+                <w:b/>
+                <w:bCs/>
+                <w:color w:val="0B3C49"/>
+              </w:rPr>
+              <w:t>Étape 4</w:t>
+            </w:r>
+          </w:p>
+          <w:p>
+            <w:r>
+              <w:rPr>
+                <w:rFonts w:ascii="Consolas" w:eastAsia="Consolas" w:hAnsi="Consolas" w:cs="Consolas"/>
+              </w:rPr>
+              <w:t>« Voici 5 résumés d'articles sur [thème] : [coller]. Propose 3 gaps de recherche. Pour chacun : le type (contexte, population, méthode, théorie, résultats contradictoires, données datées) et les articles qui le justifient. N'invente aucun article. »</w:t>
+            </w:r>
+          </w:p>
+        </w:tc>
+      </w:tr>
+    </w:tbl>
+    <w:p>
+      <w:pPr>
+        <w:pStyle w:val="Titre2"/>
+      </w:pPr>
+      <w:r>
+        <w:t>Les 3 gaps proposés, vérifiés</w:t>
+      </w:r>
+    </w:p>
+    <w:tbl>
+      <w:tblPr>
+        <w:tblW w:w="9638" w:type="dxa"/>
+        <w:tblBorders>
+          <w:top w:val="single" w:sz="4" w:space="0" w:color="auto"/>
+          <w:left w:val="single" w:sz="4" w:space="0" w:color="auto"/>
+          <w:bottom w:val="single" w:sz="4" w:space="0" w:color="auto"/>
+          <w:right w:val="single" w:sz="4" w:space="0" w:color="auto"/>
+          <w:insideH w:val="single" w:sz="4" w:space="0" w:color="auto"/>
+          <w:insideV w:val="single" w:sz="4" w:space="0" w:color="auto"/>
+        </w:tblBorders>
+        <w:tblCellMar>
+          <w:left w:w="10" w:type="dxa"/>
+          <w:right w:w="10" w:type="dxa"/>
+        </w:tblCellMar>
+        <w:tblLook w:val="04A0" w:firstRow="1" w:lastRow="0" w:firstColumn="1" w:lastColumn="0" w:noHBand="0" w:noVBand="1"/>
+      </w:tblPr>
+      <w:tblGrid>
+        <w:gridCol w:w="3300"/>
+        <w:gridCol w:w="1500"/>
+        <w:gridCol w:w="3138"/>
+        <w:gridCol w:w="1700"/>
+      </w:tblGrid>
+      <w:tr>
+        <w:tblPrEx>
+          <w:tblCellMar>
+            <w:top w:w="0" w:type="dxa"/>
+            <w:bottom w:w="0" w:type="dxa"/>
+          </w:tblCellMar>
+        </w:tblPrEx>
+        <w:trPr>
+          <w:cantSplit/>
+          <w:tblHeader/>
+        </w:trPr>
+        <w:tc>
+          <w:tcPr>
+            <w:tcW w:w="3300" w:type="dxa"/>
+            <w:tcBorders>
+              <w:top w:val="single" w:sz="4" w:space="0" w:color="B9C9CC"/>
+              <w:left w:val="single" w:sz="4" w:space="0" w:color="B9C9CC"/>
+              <w:bottom w:val="single" w:sz="4" w:space="0" w:color="B9C9CC"/>
+              <w:right w:val="single" w:sz="4" w:space="0" w:color="B9C9CC"/>
+            </w:tcBorders>
+            <w:shd w:val="clear" w:color="auto" w:fill="0B3C49"/>
+            <w:tcMar>
+              <w:top w:w="80" w:type="dxa"/>
+              <w:left w:w="120" w:type="dxa"/>
+              <w:bottom w:w="80" w:type="dxa"/>
+              <w:right w:w="120" w:type="dxa"/>
+            </w:tcMar>
+          </w:tcPr>
+          <w:p>
+            <w:r>
+              <w:rPr>
+                <w:b/>
+                <w:bCs/>
+                <w:color w:val="FFFFFF"/>
+              </w:rPr>
+              <w:t>Gap proposé par l'IA</w:t>
+            </w:r>
+          </w:p>
+        </w:tc>
+        <w:tc>
+          <w:tcPr>
+            <w:tcW w:w="1500" w:type="dxa"/>
+            <w:tcBorders>
+              <w:top w:val="single" w:sz="4" w:space="0" w:color="B9C9CC"/>
+              <w:left w:val="single" w:sz="4" w:space="0" w:color="B9C9CC"/>
+              <w:bottom w:val="single" w:sz="4" w:space="0" w:color="B9C9CC"/>
+              <w:right w:val="single" w:sz="4" w:space="0" w:color="B9C9CC"/>
+            </w:tcBorders>
+            <w:shd w:val="clear" w:color="auto" w:fill="0B3C49"/>
+            <w:tcMar>
+              <w:top w:w="80" w:type="dxa"/>
+              <w:left w:w="120" w:type="dxa"/>
+              <w:bottom w:w="80" w:type="dxa"/>
+              <w:right w:w="120" w:type="dxa"/>
+            </w:tcMar>
+          </w:tcPr>
+          <w:p>
+            <w:r>
+              <w:rPr>
+                <w:b/>
+                <w:bCs/>
+                <w:color w:val="FFFFFF"/>
+              </w:rPr>
+              <w:t>Type</w:t>
+            </w:r>
+          </w:p>
+        </w:tc>
+        <w:tc>
+          <w:tcPr>
+            <w:tcW w:w="3138" w:type="dxa"/>
+            <w:tcBorders>
+              <w:top w:val="single" w:sz="4" w:space="0" w:color="B9C9CC"/>
+              <w:left w:val="single" w:sz="4" w:space="0" w:color="B9C9CC"/>
+              <w:bottom w:val="single" w:sz="4" w:space="0" w:color="B9C9CC"/>
+              <w:right w:val="single" w:sz="4" w:space="0" w:color="B9C9CC"/>
+            </w:tcBorders>
+            <w:shd w:val="clear" w:color="auto" w:fill="0B3C49"/>
+            <w:tcMar>
+              <w:top w:w="80" w:type="dxa"/>
+              <w:left w:w="120" w:type="dxa"/>
+              <w:bottom w:w="80" w:type="dxa"/>
+              <w:right w:w="120" w:type="dxa"/>
+            </w:tcMar>
+          </w:tcPr>
+          <w:p>
+            <w:r>
+              <w:rPr>
+                <w:b/>
+                <w:bCs/>
+                <w:color w:val="FFFFFF"/>
+              </w:rPr>
+              <w:t>Ma recherche : déjà traité ? (requête, résultat)</w:t>
+            </w:r>
+          </w:p>
+        </w:tc>
+        <w:tc>
+          <w:tcPr>
+            <w:tcW w:w="1700" w:type="dxa"/>
+            <w:tcBorders>
+              <w:top w:val="single" w:sz="4" w:space="0" w:color="B9C9CC"/>
+              <w:left w:val="single" w:sz="4" w:space="0" w:color="B9C9CC"/>
+              <w:bottom w:val="single" w:sz="4" w:space="0" w:color="B9C9CC"/>
+              <w:right w:val="single" w:sz="4" w:space="0" w:color="B9C9CC"/>
+            </w:tcBorders>
+            <w:shd w:val="clear" w:color="auto" w:fill="0B3C49"/>
+            <w:tcMar>
+              <w:top w:w="80" w:type="dxa"/>
+              <w:left w:w="120" w:type="dxa"/>
+              <w:bottom w:w="80" w:type="dxa"/>
+              <w:right w:w="120" w:type="dxa"/>
+            </w:tcMar>
+          </w:tcPr>
+          <w:p>
+            <w:r>
+              <w:rPr>
+                <w:b/>
+                <w:bCs/>
+                <w:color w:val="FFFFFF"/>
+              </w:rPr>
+              <w:t>Je le garde ?</w:t>
+            </w:r>
+          </w:p>
+        </w:tc>
+      </w:tr>
+      <w:tr>
+        <w:tblPrEx>
+          <w:tblCellMar>
+            <w:top w:w="0" w:type="dxa"/>
+            <w:bottom w:w="0" w:type="dxa"/>
+          </w:tblCellMar>
+        </w:tblPrEx>
+        <w:trPr>
+          <w:cantSplit/>
+          <w:trHeight w:val="800"/>
+        </w:trPr>
+        <w:tc>
+          <w:tcPr>
+            <w:tcW w:w="3300" w:type="dxa"/>
+            <w:tcBorders>
+              <w:top w:val="single" w:sz="4" w:space="0" w:color="B9C9CC"/>
+              <w:left w:val="single" w:sz="4" w:space="0" w:color="B9C9CC"/>
+              <w:bottom w:val="single" w:sz="4" w:space="0" w:color="B9C9CC"/>
+              <w:right w:val="single" w:sz="4" w:space="0" w:color="B9C9CC"/>
+            </w:tcBorders>
+            <w:shd w:val="clear" w:color="auto" w:fill="EAF3F2"/>
+            <w:tcMar>
+              <w:top w:w="80" w:type="dxa"/>
+              <w:left w:w="120" w:type="dxa"/>
+              <w:bottom w:w="80" w:type="dxa"/>
+              <w:right w:w="120" w:type="dxa"/>
+            </w:tcMar>
+          </w:tcPr>
+          <w:p>
+            <w:r>
+              <w:rPr>
+                <w:b/>
+                <w:bCs/>
+              </w:rPr>
+              <w:t>1.</w:t>
+            </w:r>
+          </w:p>
+        </w:tc>
+        <w:tc>
+          <w:tcPr>
+            <w:tcW w:w="1500" w:type="dxa"/>
+            <w:tcBorders>
+              <w:top w:val="single" w:sz="4" w:space="0" w:color="B9C9CC"/>
+              <w:left w:val="single" w:sz="4" w:space="0" w:color="B9C9CC"/>
+              <w:bottom w:val="single" w:sz="4" w:space="0" w:color="B9C9CC"/>
+              <w:right w:val="single" w:sz="4" w:space="0" w:color="B9C9CC"/>
+            </w:tcBorders>
+            <w:tcMar>
+              <w:top w:w="80" w:type="dxa"/>
+              <w:left w:w="120" w:type="dxa"/>
+              <w:bottom w:w="80" w:type="dxa"/>
+              <w:right w:w="120" w:type="dxa"/>
+            </w:tcMar>
+          </w:tcPr>
+          <w:p/>
+        </w:tc>
+        <w:tc>
+          <w:tcPr>
+            <w:tcW w:w="3138" w:type="dxa"/>
+            <w:tcBorders>
+              <w:top w:val="single" w:sz="4" w:space="0" w:color="B9C9CC"/>
+              <w:left w:val="single" w:sz="4" w:space="0" w:color="B9C9CC"/>
+              <w:bottom w:val="single" w:sz="4" w:space="0" w:color="B9C9CC"/>
+              <w:right w:val="single" w:sz="4" w:space="0" w:color="B9C9CC"/>
+            </w:tcBorders>
+            <w:tcMar>
+              <w:top w:w="80" w:type="dxa"/>
+              <w:left w:w="120" w:type="dxa"/>
+              <w:bottom w:w="80" w:type="dxa"/>
+              <w:right w:w="120" w:type="dxa"/>
+            </w:tcMar>
+          </w:tcPr>
+          <w:p/>
+        </w:tc>
+        <w:tc>
+          <w:tcPr>
+            <w:tcW w:w="1700" w:type="dxa"/>
+            <w:tcBorders>
+              <w:top w:val="single" w:sz="4" w:space="0" w:color="B9C9CC"/>
+              <w:left w:val="single" w:sz="4" w:space="0" w:color="B9C9CC"/>
+              <w:bottom w:val="single" w:sz="4" w:space="0" w:color="B9C9CC"/>
+              <w:right w:val="single" w:sz="4" w:space="0" w:color="B9C9CC"/>
+            </w:tcBorders>
+            <w:tcMar>
+              <w:top w:w="80" w:type="dxa"/>
+              <w:left w:w="120" w:type="dxa"/>
+              <w:bottom w:w="80" w:type="dxa"/>
+              <w:right w:w="120" w:type="dxa"/>
+            </w:tcMar>
+          </w:tcPr>
+          <w:p>
+            <w:r>
+              <w:t>☐</w:t>
+            </w:r>
+            <w:r>
+              <w:t xml:space="preserve"> Oui  ☐ Non</w:t>
+            </w:r>
+          </w:p>
+        </w:tc>
+      </w:tr>
+      <w:tr>
+        <w:tblPrEx>
+          <w:tblCellMar>
+            <w:top w:w="0" w:type="dxa"/>
+            <w:bottom w:w="0" w:type="dxa"/>
+          </w:tblCellMar>
+        </w:tblPrEx>
+        <w:trPr>
+          <w:cantSplit/>
+          <w:trHeight w:val="800"/>
+        </w:trPr>
+        <w:tc>
+          <w:tcPr>
+            <w:tcW w:w="3300" w:type="dxa"/>
+            <w:tcBorders>
+              <w:top w:val="single" w:sz="4" w:space="0" w:color="B9C9CC"/>
+              <w:left w:val="single" w:sz="4" w:space="0" w:color="B9C9CC"/>
+              <w:bottom w:val="single" w:sz="4" w:space="0" w:color="B9C9CC"/>
+              <w:right w:val="single" w:sz="4" w:space="0" w:color="B9C9CC"/>
+            </w:tcBorders>
+            <w:shd w:val="clear" w:color="auto" w:fill="EAF3F2"/>
+            <w:tcMar>
+              <w:top w:w="80" w:type="dxa"/>
+              <w:left w:w="120" w:type="dxa"/>
+              <w:bottom w:w="80" w:type="dxa"/>
+              <w:right w:w="120" w:type="dxa"/>
+            </w:tcMar>
+          </w:tcPr>
+          <w:p>
+            <w:r>
+              <w:rPr>
+                <w:b/>
+                <w:bCs/>
+              </w:rPr>
+              <w:t>2.</w:t>
+            </w:r>
+          </w:p>
+        </w:tc>
+        <w:tc>
+          <w:tcPr>
+            <w:tcW w:w="1500" w:type="dxa"/>
+            <w:tcBorders>
+              <w:top w:val="single" w:sz="4" w:space="0" w:color="B9C9CC"/>
+              <w:left w:val="single" w:sz="4" w:space="0" w:color="B9C9CC"/>
+              <w:bottom w:val="single" w:sz="4" w:space="0" w:color="B9C9CC"/>
+              <w:right w:val="single" w:sz="4" w:space="0" w:color="B9C9CC"/>
+            </w:tcBorders>
+            <w:tcMar>
+              <w:top w:w="80" w:type="dxa"/>
+              <w:left w:w="120" w:type="dxa"/>
+              <w:bottom w:w="80" w:type="dxa"/>
+              <w:right w:w="120" w:type="dxa"/>
+            </w:tcMar>
+          </w:tcPr>
+          <w:p/>
+        </w:tc>
+        <w:tc>
+          <w:tcPr>
+            <w:tcW w:w="3138" w:type="dxa"/>
+            <w:tcBorders>
+              <w:top w:val="single" w:sz="4" w:space="0" w:color="B9C9CC"/>
+              <w:left w:val="single" w:sz="4" w:space="0" w:color="B9C9CC"/>
+              <w:bottom w:val="single" w:sz="4" w:space="0" w:color="B9C9CC"/>
+              <w:right w:val="single" w:sz="4" w:space="0" w:color="B9C9CC"/>
+            </w:tcBorders>
+            <w:tcMar>
+              <w:top w:w="80" w:type="dxa"/>
+              <w:left w:w="120" w:type="dxa"/>
+              <w:bottom w:w="80" w:type="dxa"/>
+              <w:right w:w="120" w:type="dxa"/>
+            </w:tcMar>
+          </w:tcPr>
+          <w:p/>
+        </w:tc>
+        <w:tc>
+          <w:tcPr>
+            <w:tcW w:w="1700" w:type="dxa"/>
+            <w:tcBorders>
+              <w:top w:val="single" w:sz="4" w:space="0" w:color="B9C9CC"/>
+              <w:left w:val="single" w:sz="4" w:space="0" w:color="B9C9CC"/>
+              <w:bottom w:val="single" w:sz="4" w:space="0" w:color="B9C9CC"/>
+              <w:right w:val="single" w:sz="4" w:space="0" w:color="B9C9CC"/>
+            </w:tcBorders>
+            <w:tcMar>
+              <w:top w:w="80" w:type="dxa"/>
+              <w:left w:w="120" w:type="dxa"/>
+              <w:bottom w:w="80" w:type="dxa"/>
+              <w:right w:w="120" w:type="dxa"/>
+            </w:tcMar>
+          </w:tcPr>
+          <w:p>
+            <w:r>
+              <w:t>☐</w:t>
+            </w:r>
+            <w:r>
+              <w:t xml:space="preserve"> Oui  ☐ Non</w:t>
+            </w:r>
+          </w:p>
+        </w:tc>
+      </w:tr>
+      <w:tr>
+        <w:tblPrEx>
+          <w:tblCellMar>
+            <w:top w:w="0" w:type="dxa"/>
+            <w:bottom w:w="0" w:type="dxa"/>
+          </w:tblCellMar>
+        </w:tblPrEx>
+        <w:trPr>
+          <w:cantSplit/>
+          <w:trHeight w:val="800"/>
+        </w:trPr>
+        <w:tc>
+          <w:tcPr>
+            <w:tcW w:w="3300" w:type="dxa"/>
+            <w:tcBorders>
+              <w:top w:val="single" w:sz="4" w:space="0" w:color="B9C9CC"/>
+              <w:left w:val="single" w:sz="4" w:space="0" w:color="B9C9CC"/>
+              <w:bottom w:val="single" w:sz="4" w:space="0" w:color="B9C9CC"/>
+              <w:right w:val="single" w:sz="4" w:space="0" w:color="B9C9CC"/>
+            </w:tcBorders>
+            <w:shd w:val="clear" w:color="auto" w:fill="EAF3F2"/>
+            <w:tcMar>
+              <w:top w:w="80" w:type="dxa"/>
+              <w:left w:w="120" w:type="dxa"/>
+              <w:bottom w:w="80" w:type="dxa"/>
+              <w:right w:w="120" w:type="dxa"/>
+            </w:tcMar>
+          </w:tcPr>
+          <w:p>
+            <w:r>
+              <w:rPr>
+                <w:b/>
+                <w:bCs/>
+              </w:rPr>
+              <w:t>3.</w:t>
+            </w:r>
+          </w:p>
+        </w:tc>
+        <w:tc>
+          <w:tcPr>
+            <w:tcW w:w="1500" w:type="dxa"/>
+            <w:tcBorders>
+              <w:top w:val="single" w:sz="4" w:space="0" w:color="B9C9CC"/>
+              <w:left w:val="single" w:sz="4" w:space="0" w:color="B9C9CC"/>
+              <w:bottom w:val="single" w:sz="4" w:space="0" w:color="B9C9CC"/>
+              <w:right w:val="single" w:sz="4" w:space="0" w:color="B9C9CC"/>
+            </w:tcBorders>
+            <w:tcMar>
+              <w:top w:w="80" w:type="dxa"/>
+              <w:left w:w="120" w:type="dxa"/>
+              <w:bottom w:w="80" w:type="dxa"/>
+              <w:right w:w="120" w:type="dxa"/>
+            </w:tcMar>
+          </w:tcPr>
+          <w:p/>
+        </w:tc>
+        <w:tc>
+          <w:tcPr>
+            <w:tcW w:w="3138" w:type="dxa"/>
+            <w:tcBorders>
+              <w:top w:val="single" w:sz="4" w:space="0" w:color="B9C9CC"/>
+              <w:left w:val="single" w:sz="4" w:space="0" w:color="B9C9CC"/>
+              <w:bottom w:val="single" w:sz="4" w:space="0" w:color="B9C9CC"/>
+              <w:right w:val="single" w:sz="4" w:space="0" w:color="B9C9CC"/>
+            </w:tcBorders>
+            <w:tcMar>
+              <w:top w:w="80" w:type="dxa"/>
+              <w:left w:w="120" w:type="dxa"/>
+              <w:bottom w:w="80" w:type="dxa"/>
+              <w:right w:w="120" w:type="dxa"/>
+            </w:tcMar>
+          </w:tcPr>
+          <w:p/>
+        </w:tc>
+        <w:tc>
+          <w:tcPr>
+            <w:tcW w:w="1700" w:type="dxa"/>
+            <w:tcBorders>
+              <w:top w:val="single" w:sz="4" w:space="0" w:color="B9C9CC"/>
+              <w:left w:val="single" w:sz="4" w:space="0" w:color="B9C9CC"/>
+              <w:bottom w:val="single" w:sz="4" w:space="0" w:color="B9C9CC"/>
+              <w:right w:val="single" w:sz="4" w:space="0" w:color="B9C9CC"/>
+            </w:tcBorders>
+            <w:tcMar>
+              <w:top w:w="80" w:type="dxa"/>
+              <w:left w:w="120" w:type="dxa"/>
+              <w:bottom w:w="80" w:type="dxa"/>
+              <w:right w:w="120" w:type="dxa"/>
+            </w:tcMar>
+          </w:tcPr>
+          <w:p>
+            <w:r>
+              <w:t>☐</w:t>
+            </w:r>
+            <w:r>
+              <w:t xml:space="preserve"> Oui  ☐ Non</w:t>
+            </w:r>
+          </w:p>
+        </w:tc>
+      </w:tr>
+    </w:tbl>
+    <w:p>
+      <w:pPr>
+        <w:pStyle w:val="Titre2"/>
+      </w:pPr>
+      <w:r>
+        <w:t>Ma question de recherche (une phrase)</w:t>
+      </w:r>
+    </w:p>
+    <w:tbl>
+      <w:tblPr>
+        <w:tblW w:w="9638" w:type="dxa"/>
+        <w:tblBorders>
+          <w:top w:val="single" w:sz="4" w:space="0" w:color="auto"/>
+          <w:left w:val="single" w:sz="4" w:space="0" w:color="auto"/>
+          <w:bottom w:val="single" w:sz="4" w:space="0" w:color="auto"/>
+          <w:right w:val="single" w:sz="4" w:space="0" w:color="auto"/>
+          <w:insideH w:val="single" w:sz="4" w:space="0" w:color="auto"/>
+          <w:insideV w:val="single" w:sz="4" w:space="0" w:color="auto"/>
+        </w:tblBorders>
+        <w:tblCellMar>
+          <w:left w:w="10" w:type="dxa"/>
+          <w:right w:w="10" w:type="dxa"/>
+        </w:tblCellMar>
+        <w:tblLook w:val="04A0" w:firstRow="1" w:lastRow="0" w:firstColumn="1" w:lastColumn="0" w:noHBand="0" w:noVBand="1"/>
+      </w:tblPr>
+      <w:tblGrid>
+        <w:gridCol w:w="2600"/>
+        <w:gridCol w:w="1500"/>
+        <w:gridCol w:w="5538"/>
+      </w:tblGrid>
+      <w:tr>
+        <w:tblPrEx>
+          <w:tblCellMar>
+            <w:top w:w="0" w:type="dxa"/>
+            <w:bottom w:w="0" w:type="dxa"/>
+          </w:tblCellMar>
+        </w:tblPrEx>
+        <w:trPr>
+          <w:cantSplit/>
+        </w:trPr>
+        <w:tc>
+          <w:tcPr>
+            <w:tcW w:w="9638" w:type="dxa"/>
+            <w:gridSpan w:val="3"/>
+            <w:tcBorders>
+              <w:top w:val="single" w:sz="4" w:space="0" w:color="B9C9CC"/>
+              <w:left w:val="single" w:sz="4" w:space="0" w:color="B9C9CC"/>
+              <w:bottom w:val="single" w:sz="4" w:space="0" w:color="B9C9CC"/>
+              <w:right w:val="single" w:sz="4" w:space="0" w:color="B9C9CC"/>
+            </w:tcBorders>
+            <w:tcMar>
+              <w:top w:w="80" w:type="dxa"/>
+              <w:left w:w="120" w:type="dxa"/>
+              <w:bottom w:w="80" w:type="dxa"/>
+              <w:right w:w="120" w:type="dxa"/>
+            </w:tcMar>
+          </w:tcPr>
+          <w:p/>
+          <w:p/>
+        </w:tc>
+      </w:tr>
+      <w:tr>
+        <w:tblPrEx>
+          <w:tblCellMar>
+            <w:top w:w="0" w:type="dxa"/>
+            <w:bottom w:w="0" w:type="dxa"/>
+          </w:tblCellMar>
+        </w:tblPrEx>
+        <w:trPr>
+          <w:cantSplit/>
+          <w:tblHeader/>
+        </w:trPr>
+        <w:tc>
+          <w:tcPr>
+            <w:tcW w:w="2600" w:type="dxa"/>
+            <w:tcBorders>
+              <w:top w:val="single" w:sz="4" w:space="0" w:color="B9C9CC"/>
+              <w:left w:val="single" w:sz="4" w:space="0" w:color="B9C9CC"/>
+              <w:bottom w:val="single" w:sz="4" w:space="0" w:color="B9C9CC"/>
+              <w:right w:val="single" w:sz="4" w:space="0" w:color="B9C9CC"/>
+            </w:tcBorders>
+            <w:shd w:val="clear" w:color="auto" w:fill="0B3C49"/>
+            <w:tcMar>
+              <w:top w:w="80" w:type="dxa"/>
+              <w:left w:w="120" w:type="dxa"/>
+              <w:bottom w:w="80" w:type="dxa"/>
+              <w:right w:w="120" w:type="dxa"/>
+            </w:tcMar>
+          </w:tcPr>
+          <w:p>
+            <w:r>
+              <w:rPr>
+                <w:b/>
+                <w:bCs/>
+                <w:color w:val="FFFFFF"/>
+              </w:rPr>
+              <w:t>Test FINER</w:t>
+            </w:r>
+          </w:p>
+        </w:tc>
+        <w:tc>
+          <w:tcPr>
+            <w:tcW w:w="1500" w:type="dxa"/>
+            <w:tcBorders>
+              <w:top w:val="single" w:sz="4" w:space="0" w:color="B9C9CC"/>
+              <w:left w:val="single" w:sz="4" w:space="0" w:color="B9C9CC"/>
+              <w:bottom w:val="single" w:sz="4" w:space="0" w:color="B9C9CC"/>
+              <w:right w:val="single" w:sz="4" w:space="0" w:color="B9C9CC"/>
+            </w:tcBorders>
+            <w:shd w:val="clear" w:color="auto" w:fill="0B3C49"/>
+            <w:tcMar>
+              <w:top w:w="80" w:type="dxa"/>
+              <w:left w:w="120" w:type="dxa"/>
+              <w:bottom w:w="80" w:type="dxa"/>
+              <w:right w:w="120" w:type="dxa"/>
+            </w:tcMar>
+          </w:tcPr>
+          <w:p>
+            <w:r>
+              <w:rPr>
+                <w:b/>
+                <w:bCs/>
+                <w:color w:val="FFFFFF"/>
+              </w:rPr>
+              <w:t>OK ?</w:t>
+            </w:r>
+          </w:p>
+        </w:tc>
+        <w:tc>
+          <w:tcPr>
+            <w:tcW w:w="5538" w:type="dxa"/>
+            <w:tcBorders>
+              <w:top w:val="single" w:sz="4" w:space="0" w:color="B9C9CC"/>
+              <w:left w:val="single" w:sz="4" w:space="0" w:color="B9C9CC"/>
+              <w:bottom w:val="single" w:sz="4" w:space="0" w:color="B9C9CC"/>
+              <w:right w:val="single" w:sz="4" w:space="0" w:color="B9C9CC"/>
+            </w:tcBorders>
+            <w:shd w:val="clear" w:color="auto" w:fill="0B3C49"/>
+            <w:tcMar>
+              <w:top w:w="80" w:type="dxa"/>
+              <w:left w:w="120" w:type="dxa"/>
+              <w:bottom w:w="80" w:type="dxa"/>
+              <w:right w:w="120" w:type="dxa"/>
+            </w:tcMar>
+          </w:tcPr>
+          <w:p>
+            <w:r>
+              <w:rPr>
+                <w:b/>
+                <w:bCs/>
+                <w:color w:val="FFFFFF"/>
+              </w:rPr>
+              <w:t>Justification</w:t>
+            </w:r>
+          </w:p>
+        </w:tc>
+      </w:tr>
+      <w:tr>
+        <w:tblPrEx>
+          <w:tblCellMar>
+            <w:top w:w="0" w:type="dxa"/>
+            <w:bottom w:w="0" w:type="dxa"/>
+          </w:tblCellMar>
+        </w:tblPrEx>
+        <w:trPr>
+          <w:cantSplit/>
+          <w:trHeight w:val="420"/>
+        </w:trPr>
+        <w:tc>
+          <w:tcPr>
+            <w:tcW w:w="2600" w:type="dxa"/>
+            <w:tcBorders>
+              <w:top w:val="single" w:sz="4" w:space="0" w:color="B9C9CC"/>
+              <w:left w:val="single" w:sz="4" w:space="0" w:color="B9C9CC"/>
+              <w:bottom w:val="single" w:sz="4" w:space="0" w:color="B9C9CC"/>
+              <w:right w:val="single" w:sz="4" w:space="0" w:color="B9C9CC"/>
+            </w:tcBorders>
+            <w:shd w:val="clear" w:color="auto" w:fill="EAF3F2"/>
+            <w:tcMar>
+              <w:top w:w="80" w:type="dxa"/>
+              <w:left w:w="120" w:type="dxa"/>
+              <w:bottom w:w="80" w:type="dxa"/>
+              <w:right w:w="120" w:type="dxa"/>
+            </w:tcMar>
+          </w:tcPr>
+          <w:p>
+            <w:r>
+              <w:rPr>
+                <w:b/>
+                <w:bCs/>
+              </w:rPr>
+              <w:t>Faisable (temps, terrain, budget)</w:t>
+            </w:r>
+          </w:p>
+        </w:tc>
+        <w:tc>
+          <w:tcPr>
+            <w:tcW w:w="1500" w:type="dxa"/>
+            <w:tcBorders>
+              <w:top w:val="single" w:sz="4" w:space="0" w:color="B9C9CC"/>
+              <w:left w:val="single" w:sz="4" w:space="0" w:color="B9C9CC"/>
+              <w:bottom w:val="single" w:sz="4" w:space="0" w:color="B9C9CC"/>
+              <w:right w:val="single" w:sz="4" w:space="0" w:color="B9C9CC"/>
+            </w:tcBorders>
+            <w:tcMar>
+              <w:top w:w="80" w:type="dxa"/>
+              <w:left w:w="120" w:type="dxa"/>
+              <w:bottom w:w="80" w:type="dxa"/>
+              <w:right w:w="120" w:type="dxa"/>
+            </w:tcMar>
+          </w:tcPr>
+          <w:p>
+            <w:r>
+              <w:t>☐</w:t>
+            </w:r>
+          </w:p>
+        </w:tc>
+        <w:tc>
+          <w:tcPr>
+            <w:tcW w:w="5538" w:type="dxa"/>
+            <w:tcBorders>
+              <w:top w:val="single" w:sz="4" w:space="0" w:color="B9C9CC"/>
+              <w:left w:val="single" w:sz="4" w:space="0" w:color="B9C9CC"/>
+              <w:bottom w:val="single" w:sz="4" w:space="0" w:color="B9C9CC"/>
+              <w:right w:val="single" w:sz="4" w:space="0" w:color="B9C9CC"/>
+            </w:tcBorders>
+            <w:tcMar>
+              <w:top w:w="80" w:type="dxa"/>
+              <w:left w:w="120" w:type="dxa"/>
+              <w:bottom w:w="80" w:type="dxa"/>
+              <w:right w:w="120" w:type="dxa"/>
+            </w:tcMar>
+          </w:tcPr>
+          <w:p/>
+        </w:tc>
+      </w:tr>
+      <w:tr>
+        <w:tblPrEx>
+          <w:tblCellMar>
+            <w:top w:w="0" w:type="dxa"/>
+            <w:bottom w:w="0" w:type="dxa"/>
+          </w:tblCellMar>
+        </w:tblPrEx>
+        <w:trPr>
+          <w:cantSplit/>
+          <w:trHeight w:val="420"/>
+        </w:trPr>
+        <w:tc>
+          <w:tcPr>
+            <w:tcW w:w="2600" w:type="dxa"/>
+            <w:tcBorders>
+              <w:top w:val="single" w:sz="4" w:space="0" w:color="B9C9CC"/>
+              <w:left w:val="single" w:sz="4" w:space="0" w:color="B9C9CC"/>
+              <w:bottom w:val="single" w:sz="4" w:space="0" w:color="B9C9CC"/>
+              <w:right w:val="single" w:sz="4" w:space="0" w:color="B9C9CC"/>
+            </w:tcBorders>
+            <w:shd w:val="clear" w:color="auto" w:fill="EAF3F2"/>
+            <w:tcMar>
+              <w:top w:w="80" w:type="dxa"/>
+              <w:left w:w="120" w:type="dxa"/>
+              <w:bottom w:w="80" w:type="dxa"/>
+              <w:right w:w="120" w:type="dxa"/>
+            </w:tcMar>
+          </w:tcPr>
+          <w:p>
+            <w:r>
+              <w:rPr>
+                <w:b/>
+                <w:bCs/>
+              </w:rPr>
+              <w:t>Intéressant</w:t>
+            </w:r>
+          </w:p>
+        </w:tc>
+        <w:tc>
+          <w:tcPr>
+            <w:tcW w:w="1500" w:type="dxa"/>
+            <w:tcBorders>
+              <w:top w:val="single" w:sz="4" w:space="0" w:color="B9C9CC"/>
+              <w:left w:val="single" w:sz="4" w:space="0" w:color="B9C9CC"/>
+              <w:bottom w:val="single" w:sz="4" w:space="0" w:color="B9C9CC"/>
+              <w:right w:val="single" w:sz="4" w:space="0" w:color="B9C9CC"/>
+            </w:tcBorders>
+            <w:tcMar>
+              <w:top w:w="80" w:type="dxa"/>
+              <w:left w:w="120" w:type="dxa"/>
+              <w:bottom w:w="80" w:type="dxa"/>
+              <w:right w:w="120" w:type="dxa"/>
+            </w:tcMar>
+          </w:tcPr>
+          <w:p>
+            <w:r>
+              <w:t>☐</w:t>
+            </w:r>
+          </w:p>
+        </w:tc>
+        <w:tc>
+          <w:tcPr>
+            <w:tcW w:w="5538" w:type="dxa"/>
+            <w:tcBorders>
+              <w:top w:val="single" w:sz="4" w:space="0" w:color="B9C9CC"/>
+              <w:left w:val="single" w:sz="4" w:space="0" w:color="B9C9CC"/>
+              <w:bottom w:val="single" w:sz="4" w:space="0" w:color="B9C9CC"/>
+              <w:right w:val="single" w:sz="4" w:space="0" w:color="B9C9CC"/>
+            </w:tcBorders>
+            <w:tcMar>
+              <w:top w:w="80" w:type="dxa"/>
+              <w:left w:w="120" w:type="dxa"/>
+              <w:bottom w:w="80" w:type="dxa"/>
+              <w:right w:w="120" w:type="dxa"/>
+            </w:tcMar>
+          </w:tcPr>
+          <w:p/>
+        </w:tc>
+      </w:tr>
+      <w:tr>
+        <w:tblPrEx>
+          <w:tblCellMar>
+            <w:top w:w="0" w:type="dxa"/>
+            <w:bottom w:w="0" w:type="dxa"/>
+          </w:tblCellMar>
+        </w:tblPrEx>
+        <w:trPr>
+          <w:cantSplit/>
+          <w:trHeight w:val="420"/>
+        </w:trPr>
+        <w:tc>
+          <w:tcPr>
+            <w:tcW w:w="2600" w:type="dxa"/>
+            <w:tcBorders>
+              <w:top w:val="single" w:sz="4" w:space="0" w:color="B9C9CC"/>
+              <w:left w:val="single" w:sz="4" w:space="0" w:color="B9C9CC"/>
+              <w:bottom w:val="single" w:sz="4" w:space="0" w:color="B9C9CC"/>
+              <w:right w:val="single" w:sz="4" w:space="0" w:color="B9C9CC"/>
+            </w:tcBorders>
+            <w:shd w:val="clear" w:color="auto" w:fill="EAF3F2"/>
+            <w:tcMar>
+              <w:top w:w="80" w:type="dxa"/>
+              <w:left w:w="120" w:type="dxa"/>
+              <w:bottom w:w="80" w:type="dxa"/>
+              <w:right w:w="120" w:type="dxa"/>
+            </w:tcMar>
+          </w:tcPr>
+          <w:p>
+            <w:r>
+              <w:rPr>
+                <w:b/>
+                <w:bCs/>
+              </w:rPr>
+              <w:t>Nouveau (gap vérifié)</w:t>
+            </w:r>
+          </w:p>
+        </w:tc>
+        <w:tc>
+          <w:tcPr>
+            <w:tcW w:w="1500" w:type="dxa"/>
+            <w:tcBorders>
+              <w:top w:val="single" w:sz="4" w:space="0" w:color="B9C9CC"/>
+              <w:left w:val="single" w:sz="4" w:space="0" w:color="B9C9CC"/>
+              <w:bottom w:val="single" w:sz="4" w:space="0" w:color="B9C9CC"/>
+              <w:right w:val="single" w:sz="4" w:space="0" w:color="B9C9CC"/>
+            </w:tcBorders>
+            <w:tcMar>
+              <w:top w:w="80" w:type="dxa"/>
+              <w:left w:w="120" w:type="dxa"/>
+              <w:bottom w:w="80" w:type="dxa"/>
+              <w:right w:w="120" w:type="dxa"/>
+            </w:tcMar>
+          </w:tcPr>
+          <w:p>
+            <w:r>
+              <w:t>☐</w:t>
+            </w:r>
+          </w:p>
+        </w:tc>
+        <w:tc>
+          <w:tcPr>
+            <w:tcW w:w="5538" w:type="dxa"/>
+            <w:tcBorders>
+              <w:top w:val="single" w:sz="4" w:space="0" w:color="B9C9CC"/>
+              <w:left w:val="single" w:sz="4" w:space="0" w:color="B9C9CC"/>
+              <w:bottom w:val="single" w:sz="4" w:space="0" w:color="B9C9CC"/>
+              <w:right w:val="single" w:sz="4" w:space="0" w:color="B9C9CC"/>
+            </w:tcBorders>
+            <w:tcMar>
+              <w:top w:w="80" w:type="dxa"/>
+              <w:left w:w="120" w:type="dxa"/>
+              <w:bottom w:w="80" w:type="dxa"/>
+              <w:right w:w="120" w:type="dxa"/>
+            </w:tcMar>
+          </w:tcPr>
+          <w:p/>
+        </w:tc>
+      </w:tr>
+      <w:tr>
+        <w:tblPrEx>
+          <w:tblCellMar>
+            <w:top w:w="0" w:type="dxa"/>
+            <w:bottom w:w="0" w:type="dxa"/>
+          </w:tblCellMar>
+        </w:tblPrEx>
+        <w:trPr>
+          <w:cantSplit/>
+          <w:trHeight w:val="420"/>
+        </w:trPr>
+        <w:tc>
+          <w:tcPr>
+            <w:tcW w:w="2600" w:type="dxa"/>
+            <w:tcBorders>
+              <w:top w:val="single" w:sz="4" w:space="0" w:color="B9C9CC"/>
+              <w:left w:val="single" w:sz="4" w:space="0" w:color="B9C9CC"/>
+              <w:bottom w:val="single" w:sz="4" w:space="0" w:color="B9C9CC"/>
+              <w:right w:val="single" w:sz="4" w:space="0" w:color="B9C9CC"/>
+            </w:tcBorders>
+            <w:shd w:val="clear" w:color="auto" w:fill="EAF3F2"/>
+            <w:tcMar>
+              <w:top w:w="80" w:type="dxa"/>
+              <w:left w:w="120" w:type="dxa"/>
+              <w:bottom w:w="80" w:type="dxa"/>
+              <w:right w:w="120" w:type="dxa"/>
+            </w:tcMar>
+          </w:tcPr>
+          <w:p>
+            <w:r>
+              <w:rPr>
+                <w:b/>
+                <w:bCs/>
+              </w:rPr>
+              <w:t>Éthique</w:t>
+            </w:r>
+          </w:p>
+        </w:tc>
+        <w:tc>
+          <w:tcPr>
+            <w:tcW w:w="1500" w:type="dxa"/>
+            <w:tcBorders>
+              <w:top w:val="single" w:sz="4" w:space="0" w:color="B9C9CC"/>
+              <w:left w:val="single" w:sz="4" w:space="0" w:color="B9C9CC"/>
+              <w:bottom w:val="single" w:sz="4" w:space="0" w:color="B9C9CC"/>
+              <w:right w:val="single" w:sz="4" w:space="0" w:color="B9C9CC"/>
+            </w:tcBorders>
+            <w:tcMar>
+              <w:top w:w="80" w:type="dxa"/>
+              <w:left w:w="120" w:type="dxa"/>
+              <w:bottom w:w="80" w:type="dxa"/>
+              <w:right w:w="120" w:type="dxa"/>
+            </w:tcMar>
+          </w:tcPr>
+          <w:p>
+            <w:r>
+              <w:t>☐</w:t>
+            </w:r>
+          </w:p>
+        </w:tc>
+        <w:tc>
+          <w:tcPr>
+            <w:tcW w:w="5538" w:type="dxa"/>
+            <w:tcBorders>
+              <w:top w:val="single" w:sz="4" w:space="0" w:color="B9C9CC"/>
+              <w:left w:val="single" w:sz="4" w:space="0" w:color="B9C9CC"/>
+              <w:bottom w:val="single" w:sz="4" w:space="0" w:color="B9C9CC"/>
+              <w:right w:val="single" w:sz="4" w:space="0" w:color="B9C9CC"/>
+            </w:tcBorders>
+            <w:tcMar>
+              <w:top w:w="80" w:type="dxa"/>
+              <w:left w:w="120" w:type="dxa"/>
+              <w:bottom w:w="80" w:type="dxa"/>
+              <w:right w:w="120" w:type="dxa"/>
+            </w:tcMar>
+          </w:tcPr>
+          <w:p/>
+        </w:tc>
+      </w:tr>
+      <w:tr>
+        <w:tblPrEx>
+          <w:tblCellMar>
+            <w:top w:w="0" w:type="dxa"/>
+            <w:bottom w:w="0" w:type="dxa"/>
+          </w:tblCellMar>
+        </w:tblPrEx>
+        <w:trPr>
+          <w:cantSplit/>
+          <w:trHeight w:val="420"/>
+        </w:trPr>
+        <w:tc>
+          <w:tcPr>
+            <w:tcW w:w="2600" w:type="dxa"/>
+            <w:tcBorders>
+              <w:top w:val="single" w:sz="4" w:space="0" w:color="B9C9CC"/>
+              <w:left w:val="single" w:sz="4" w:space="0" w:color="B9C9CC"/>
+              <w:bottom w:val="single" w:sz="4" w:space="0" w:color="B9C9CC"/>
+              <w:right w:val="single" w:sz="4" w:space="0" w:color="B9C9CC"/>
+            </w:tcBorders>
+            <w:shd w:val="clear" w:color="auto" w:fill="EAF3F2"/>
+            <w:tcMar>
+              <w:top w:w="80" w:type="dxa"/>
+              <w:left w:w="120" w:type="dxa"/>
+              <w:bottom w:w="80" w:type="dxa"/>
+              <w:right w:w="120" w:type="dxa"/>
+            </w:tcMar>
+          </w:tcPr>
+          <w:p>
+            <w:r>
+              <w:rPr>
+                <w:b/>
+                <w:bCs/>
+              </w:rPr>
+              <w:t>Pertinent (discipline, pays)</w:t>
+            </w:r>
+          </w:p>
+        </w:tc>
+        <w:tc>
+          <w:tcPr>
+            <w:tcW w:w="1500" w:type="dxa"/>
+            <w:tcBorders>
+              <w:top w:val="single" w:sz="4" w:space="0" w:color="B9C9CC"/>
+              <w:left w:val="single" w:sz="4" w:space="0" w:color="B9C9CC"/>
+              <w:bottom w:val="single" w:sz="4" w:space="0" w:color="B9C9CC"/>
+              <w:right w:val="single" w:sz="4" w:space="0" w:color="B9C9CC"/>
+            </w:tcBorders>
+            <w:tcMar>
+              <w:top w:w="80" w:type="dxa"/>
+              <w:left w:w="120" w:type="dxa"/>
+              <w:bottom w:w="80" w:type="dxa"/>
+              <w:right w:w="120" w:type="dxa"/>
+            </w:tcMar>
+          </w:tcPr>
+          <w:p>
+            <w:r>
+              <w:t>☐</w:t>
+            </w:r>
+          </w:p>
+        </w:tc>
+        <w:tc>
+          <w:tcPr>
+            <w:tcW w:w="5538" w:type="dxa"/>
+            <w:tcBorders>
+              <w:top w:val="single" w:sz="4" w:space="0" w:color="B9C9CC"/>
+              <w:left w:val="single" w:sz="4" w:space="0" w:color="B9C9CC"/>
+              <w:bottom w:val="single" w:sz="4" w:space="0" w:color="B9C9CC"/>
+              <w:right w:val="single" w:sz="4" w:space="0" w:color="B9C9CC"/>
+            </w:tcBorders>
+            <w:tcMar>
+              <w:top w:w="80" w:type="dxa"/>
+              <w:left w:w="120" w:type="dxa"/>
+              <w:bottom w:w="80" w:type="dxa"/>
+              <w:right w:w="120" w:type="dxa"/>
+            </w:tcMar>
+          </w:tcPr>
+          <w:p/>
+        </w:tc>
+      </w:tr>
+    </w:tbl>
+    <w:p>
+      <w:pPr>
+        <w:pStyle w:val="Titre2"/>
+      </w:pPr>
+      <w:r>
+        <w:lastRenderedPageBreak/>
+        <w:t>Défi · L'article suspect : relevez au moins 5 signaux d'alerte</w:t>
+      </w:r>
+    </w:p>
+    <w:p>
+      <w:r>
+        <w:rPr>
+          <w:i/>
+          <w:iCs/>
+          <w:color w:val="6B7C82"/>
+        </w:rPr>
+        <w:t>Document fictif, construit pour l'exercice. La revue, l'auteur et l'institut n'existent pas.</w:t>
+      </w:r>
+    </w:p>
+    <w:tbl>
+      <w:tblPr>
+        <w:tblW w:w="9638" w:type="dxa"/>
+        <w:tblBorders>
+          <w:top w:val="single" w:sz="4" w:space="0" w:color="auto"/>
+          <w:left w:val="single" w:sz="4" w:space="0" w:color="auto"/>
+          <w:bottom w:val="single" w:sz="4" w:space="0" w:color="auto"/>
+          <w:right w:val="single" w:sz="4" w:space="0" w:color="auto"/>
+          <w:insideH w:val="single" w:sz="4" w:space="0" w:color="auto"/>
+          <w:insideV w:val="single" w:sz="4" w:space="0" w:color="auto"/>
+        </w:tblBorders>
+        <w:tblCellMar>
+          <w:left w:w="10" w:type="dxa"/>
+          <w:right w:w="10" w:type="dxa"/>
+        </w:tblCellMar>
+        <w:tblLook w:val="04A0" w:firstRow="1" w:lastRow="0" w:firstColumn="1" w:lastColumn="0" w:noHBand="0" w:noVBand="1"/>
+      </w:tblPr>
+      <w:tblGrid>
+        <w:gridCol w:w="700"/>
+        <w:gridCol w:w="4500"/>
+        <w:gridCol w:w="4438"/>
+      </w:tblGrid>
+      <w:tr>
+        <w:tblPrEx>
+          <w:tblCellMar>
+            <w:top w:w="0" w:type="dxa"/>
+            <w:bottom w:w="0" w:type="dxa"/>
+          </w:tblCellMar>
+        </w:tblPrEx>
+        <w:trPr>
+          <w:cantSplit/>
+        </w:trPr>
+        <w:tc>
+          <w:tcPr>
+            <w:tcW w:w="9638" w:type="dxa"/>
+            <w:gridSpan w:val="3"/>
+            <w:tcBorders>
+              <w:top w:val="none" w:sz="0" w:space="0" w:color="FFFFFF"/>
+              <w:left w:val="none" w:sz="0" w:space="0" w:color="FFFFFF"/>
+              <w:bottom w:val="none" w:sz="0" w:space="0" w:color="FFFFFF"/>
+              <w:right w:val="none" w:sz="0" w:space="0" w:color="FFFFFF"/>
+            </w:tcBorders>
+            <w:shd w:val="clear" w:color="auto" w:fill="FBEDEA"/>
+            <w:tcMar>
+              <w:top w:w="140" w:type="dxa"/>
+              <w:left w:w="200" w:type="dxa"/>
+              <w:bottom w:w="140" w:type="dxa"/>
+              <w:right w:w="200" w:type="dxa"/>
+            </w:tcMar>
+          </w:tcPr>
+          <w:p>
+            <w:r>
+              <w:rPr>
+                <w:b/>
+                <w:bCs/>
+                <w:color w:val="C8553D"/>
+              </w:rPr>
+              <w:t>Global Journal of Universal Scientific Excellence (GJUSE) · Vol. 9, n° 3, 2025</w:t>
+            </w:r>
+          </w:p>
+          <w:p>
+            <w:r>
+              <w:rPr>
+                <w:b/>
+                <w:bCs/>
+                <w:sz w:val="17"/>
+                <w:szCs w:val="17"/>
+              </w:rPr>
+              <w:t xml:space="preserve">Scope: </w:t>
+            </w:r>
+            <w:r>
+              <w:rPr>
+                <w:sz w:val="17"/>
+                <w:szCs w:val="17"/>
+              </w:rPr>
+              <w:t>all fields of science, engineering, medicine, humanities and management. Publication fee: 49 USD. Received: 2 March 2025 · Accepted: 5 March 2025 · Published: 7 March 2025.</w:t>
+            </w:r>
+          </w:p>
+          <w:p>
+            <w:pPr>
+              <w:spacing w:before="120" w:after="60"/>
+            </w:pPr>
+            <w:r>
+              <w:rPr>
+                <w:b/>
+                <w:bCs/>
+                <w:sz w:val="21"/>
+                <w:szCs w:val="21"/>
+              </w:rPr>
+              <w:t>Leveraging Counterfeit Consciousness for Empowering Female Scholars in Sub-Saharan Africa: A Comprehensive Study</w:t>
+            </w:r>
+          </w:p>
+          <w:p>
+            <w:r>
+              <w:rPr>
+                <w:i/>
+                <w:iCs/>
+                <w:sz w:val="17"/>
+                <w:szCs w:val="17"/>
+              </w:rPr>
+              <w:t>J. A. Mensah, International Institute of Advanced Global Studies</w:t>
+            </w:r>
+          </w:p>
+          <w:p>
+            <w:pPr>
+              <w:jc w:val="both"/>
+            </w:pPr>
+            <w:r>
+              <w:rPr>
+                <w:b/>
+                <w:bCs/>
+                <w:sz w:val="18"/>
+                <w:szCs w:val="18"/>
+              </w:rPr>
+              <w:t xml:space="preserve">Abstract. </w:t>
+            </w:r>
+            <w:r>
+              <w:rPr>
+                <w:sz w:val="18"/>
+                <w:szCs w:val="18"/>
+              </w:rPr>
+              <w:t>Certainly! Here is a possible abstract for your article. In today's rapidly evolving landscape, the role of women in academia has become increasingly pivotal. This comprehensive study delves into the multifaceted challenges faced by female scholars in Sub-Saharan Africa and explores how counterfeit consciousness (CC) and profound learning can bridge the gender gap. Using a mixed-method approach with 1,250 respondents from 34 countries, data were collected over a period of two weeks. Results show that 100% o</w:t>
+            </w:r>
+            <w:r>
+              <w:rPr>
+                <w:sz w:val="18"/>
+                <w:szCs w:val="18"/>
+              </w:rPr>
+              <w:t>f participants agreed that CC improves research productivity (p &lt; 0.0001). These findings demonstrate that CC will completely eliminate gender inequality in African universities. As of my last knowledge update, no previous study has addressed this topic.</w:t>
+            </w:r>
+          </w:p>
+          <w:p>
+            <w:r>
+              <w:rPr>
+                <w:b/>
+                <w:bCs/>
+                <w:sz w:val="16"/>
+                <w:szCs w:val="16"/>
+              </w:rPr>
+              <w:t xml:space="preserve">References. </w:t>
+            </w:r>
+            <w:r>
+              <w:rPr>
+                <w:sz w:val="16"/>
+                <w:szCs w:val="16"/>
+              </w:rPr>
+              <w:t>[1] Smith, J. (2023). Women and AI in Africa. Journal of Gender Technology, 12(4), 1-10. [2] Kouassi, A. (2019). Les modèles féminins dans la recherche africaine. Revue africaine des sciences, 5, 22-30. [3] LeCun, Y., Bengio, Y. &amp; Hinton, G. (2015). Deep learning. Nature, 521, 436-444. [4] Mensah, J. A. (2024a). GJUSE, 8(1). [5] Mensah, J. A. (2024b). GJUSE, 8(2). [6] Mensah, J. A. (2024c). GJUSE, 8(4).</w:t>
+            </w:r>
+          </w:p>
+        </w:tc>
+      </w:tr>
+      <w:tr>
+        <w:tblPrEx>
+          <w:tblCellMar>
+            <w:top w:w="0" w:type="dxa"/>
+            <w:bottom w:w="0" w:type="dxa"/>
+          </w:tblCellMar>
+        </w:tblPrEx>
+        <w:trPr>
+          <w:cantSplit/>
+          <w:tblHeader/>
+        </w:trPr>
+        <w:tc>
+          <w:tcPr>
+            <w:tcW w:w="700" w:type="dxa"/>
+            <w:tcBorders>
+              <w:top w:val="single" w:sz="4" w:space="0" w:color="B9C9CC"/>
+              <w:left w:val="single" w:sz="4" w:space="0" w:color="B9C9CC"/>
+              <w:bottom w:val="single" w:sz="4" w:space="0" w:color="B9C9CC"/>
+              <w:right w:val="single" w:sz="4" w:space="0" w:color="B9C9CC"/>
+            </w:tcBorders>
+            <w:shd w:val="clear" w:color="auto" w:fill="0B3C49"/>
+            <w:tcMar>
+              <w:top w:w="80" w:type="dxa"/>
+              <w:left w:w="120" w:type="dxa"/>
+              <w:bottom w:w="80" w:type="dxa"/>
+              <w:right w:w="120" w:type="dxa"/>
+            </w:tcMar>
+          </w:tcPr>
+          <w:p/>
+        </w:tc>
+        <w:tc>
+          <w:tcPr>
+            <w:tcW w:w="4500" w:type="dxa"/>
+            <w:tcBorders>
+              <w:top w:val="single" w:sz="4" w:space="0" w:color="B9C9CC"/>
+              <w:left w:val="single" w:sz="4" w:space="0" w:color="B9C9CC"/>
+              <w:bottom w:val="single" w:sz="4" w:space="0" w:color="B9C9CC"/>
+              <w:right w:val="single" w:sz="4" w:space="0" w:color="B9C9CC"/>
+            </w:tcBorders>
+            <w:shd w:val="clear" w:color="auto" w:fill="0B3C49"/>
+            <w:tcMar>
+              <w:top w:w="80" w:type="dxa"/>
+              <w:left w:w="120" w:type="dxa"/>
+              <w:bottom w:w="80" w:type="dxa"/>
+              <w:right w:w="120" w:type="dxa"/>
+            </w:tcMar>
+          </w:tcPr>
+          <w:p>
+            <w:r>
+              <w:rPr>
+                <w:b/>
+                <w:bCs/>
+                <w:color w:val="FFFFFF"/>
+              </w:rPr>
+              <w:t>Signal d'alerte</w:t>
+            </w:r>
+          </w:p>
+        </w:tc>
+        <w:tc>
+          <w:tcPr>
+            <w:tcW w:w="4438" w:type="dxa"/>
+            <w:tcBorders>
+              <w:top w:val="single" w:sz="4" w:space="0" w:color="B9C9CC"/>
+              <w:left w:val="single" w:sz="4" w:space="0" w:color="B9C9CC"/>
+              <w:bottom w:val="single" w:sz="4" w:space="0" w:color="B9C9CC"/>
+              <w:right w:val="single" w:sz="4" w:space="0" w:color="B9C9CC"/>
+            </w:tcBorders>
+            <w:shd w:val="clear" w:color="auto" w:fill="0B3C49"/>
+            <w:tcMar>
+              <w:top w:w="80" w:type="dxa"/>
+              <w:left w:w="120" w:type="dxa"/>
+              <w:bottom w:w="80" w:type="dxa"/>
+              <w:right w:w="120" w:type="dxa"/>
+            </w:tcMar>
+          </w:tcPr>
+          <w:p>
+            <w:r>
+              <w:rPr>
+                <w:b/>
+                <w:bCs/>
+                <w:color w:val="FFFFFF"/>
+              </w:rPr>
+              <w:t>Où, dans le document</w:t>
+            </w:r>
+          </w:p>
+        </w:tc>
+      </w:tr>
+      <w:tr>
+        <w:tblPrEx>
+          <w:tblCellMar>
+            <w:top w:w="0" w:type="dxa"/>
+            <w:bottom w:w="0" w:type="dxa"/>
+          </w:tblCellMar>
+        </w:tblPrEx>
+        <w:trPr>
+          <w:cantSplit/>
+          <w:trHeight w:val="520"/>
+        </w:trPr>
+        <w:tc>
+          <w:tcPr>
+            <w:tcW w:w="700" w:type="dxa"/>
+            <w:tcBorders>
+              <w:top w:val="single" w:sz="4" w:space="0" w:color="B9C9CC"/>
+              <w:left w:val="single" w:sz="4" w:space="0" w:color="B9C9CC"/>
+              <w:bottom w:val="single" w:sz="4" w:space="0" w:color="B9C9CC"/>
+              <w:right w:val="single" w:sz="4" w:space="0" w:color="B9C9CC"/>
+            </w:tcBorders>
+            <w:shd w:val="clear" w:color="auto" w:fill="EAF3F2"/>
+            <w:tcMar>
+              <w:top w:w="80" w:type="dxa"/>
+              <w:left w:w="120" w:type="dxa"/>
+              <w:bottom w:w="80" w:type="dxa"/>
+              <w:right w:w="120" w:type="dxa"/>
+            </w:tcMar>
+          </w:tcPr>
+          <w:p>
+            <w:r>
+              <w:rPr>
+                <w:b/>
+                <w:bCs/>
+              </w:rPr>
+              <w:t>1</w:t>
+            </w:r>
+          </w:p>
+        </w:tc>
+        <w:tc>
+          <w:tcPr>
+            <w:tcW w:w="4500" w:type="dxa"/>
+            <w:tcBorders>
+              <w:top w:val="single" w:sz="4" w:space="0" w:color="B9C9CC"/>
+              <w:left w:val="single" w:sz="4" w:space="0" w:color="B9C9CC"/>
+              <w:bottom w:val="single" w:sz="4" w:space="0" w:color="B9C9CC"/>
+              <w:right w:val="single" w:sz="4" w:space="0" w:color="B9C9CC"/>
+            </w:tcBorders>
+            <w:tcMar>
+              <w:top w:w="80" w:type="dxa"/>
+              <w:left w:w="120" w:type="dxa"/>
+              <w:bottom w:w="80" w:type="dxa"/>
+              <w:right w:w="120" w:type="dxa"/>
+            </w:tcMar>
+          </w:tcPr>
+          <w:p/>
+        </w:tc>
+        <w:tc>
+          <w:tcPr>
+            <w:tcW w:w="4438" w:type="dxa"/>
+            <w:tcBorders>
+              <w:top w:val="single" w:sz="4" w:space="0" w:color="B9C9CC"/>
+              <w:left w:val="single" w:sz="4" w:space="0" w:color="B9C9CC"/>
+              <w:bottom w:val="single" w:sz="4" w:space="0" w:color="B9C9CC"/>
+              <w:right w:val="single" w:sz="4" w:space="0" w:color="B9C9CC"/>
+            </w:tcBorders>
+            <w:tcMar>
+              <w:top w:w="80" w:type="dxa"/>
+              <w:left w:w="120" w:type="dxa"/>
+              <w:bottom w:w="80" w:type="dxa"/>
+              <w:right w:w="120" w:type="dxa"/>
+            </w:tcMar>
+          </w:tcPr>
+          <w:p/>
+        </w:tc>
+      </w:tr>
+      <w:tr>
+        <w:tblPrEx>
+          <w:tblCellMar>
+            <w:top w:w="0" w:type="dxa"/>
+            <w:bottom w:w="0" w:type="dxa"/>
+          </w:tblCellMar>
+        </w:tblPrEx>
+        <w:trPr>
+          <w:cantSplit/>
+          <w:trHeight w:val="520"/>
+        </w:trPr>
+        <w:tc>
+          <w:tcPr>
+            <w:tcW w:w="700" w:type="dxa"/>
+            <w:tcBorders>
+              <w:top w:val="single" w:sz="4" w:space="0" w:color="B9C9CC"/>
+              <w:left w:val="single" w:sz="4" w:space="0" w:color="B9C9CC"/>
+              <w:bottom w:val="single" w:sz="4" w:space="0" w:color="B9C9CC"/>
+              <w:right w:val="single" w:sz="4" w:space="0" w:color="B9C9CC"/>
+            </w:tcBorders>
+            <w:shd w:val="clear" w:color="auto" w:fill="EAF3F2"/>
+            <w:tcMar>
+              <w:top w:w="80" w:type="dxa"/>
+              <w:left w:w="120" w:type="dxa"/>
+              <w:bottom w:w="80" w:type="dxa"/>
+              <w:right w:w="120" w:type="dxa"/>
+            </w:tcMar>
+          </w:tcPr>
+          <w:p>
+            <w:r>
+              <w:rPr>
+                <w:b/>
+                <w:bCs/>
+              </w:rPr>
+              <w:t>2</w:t>
+            </w:r>
+          </w:p>
+        </w:tc>
+        <w:tc>
+          <w:tcPr>
+            <w:tcW w:w="4500" w:type="dxa"/>
+            <w:tcBorders>
+              <w:top w:val="single" w:sz="4" w:space="0" w:color="B9C9CC"/>
+              <w:left w:val="single" w:sz="4" w:space="0" w:color="B9C9CC"/>
+              <w:bottom w:val="single" w:sz="4" w:space="0" w:color="B9C9CC"/>
+              <w:right w:val="single" w:sz="4" w:space="0" w:color="B9C9CC"/>
+            </w:tcBorders>
+            <w:tcMar>
+              <w:top w:w="80" w:type="dxa"/>
+              <w:left w:w="120" w:type="dxa"/>
+              <w:bottom w:w="80" w:type="dxa"/>
+              <w:right w:w="120" w:type="dxa"/>
+            </w:tcMar>
+          </w:tcPr>
+          <w:p/>
+        </w:tc>
+        <w:tc>
+          <w:tcPr>
+            <w:tcW w:w="4438" w:type="dxa"/>
+            <w:tcBorders>
+              <w:top w:val="single" w:sz="4" w:space="0" w:color="B9C9CC"/>
+              <w:left w:val="single" w:sz="4" w:space="0" w:color="B9C9CC"/>
+              <w:bottom w:val="single" w:sz="4" w:space="0" w:color="B9C9CC"/>
+              <w:right w:val="single" w:sz="4" w:space="0" w:color="B9C9CC"/>
+            </w:tcBorders>
+            <w:tcMar>
+              <w:top w:w="80" w:type="dxa"/>
+              <w:left w:w="120" w:type="dxa"/>
+              <w:bottom w:w="80" w:type="dxa"/>
+              <w:right w:w="120" w:type="dxa"/>
+            </w:tcMar>
+          </w:tcPr>
+          <w:p/>
+        </w:tc>
+      </w:tr>
+      <w:tr>
+        <w:tblPrEx>
+          <w:tblCellMar>
+            <w:top w:w="0" w:type="dxa"/>
+            <w:bottom w:w="0" w:type="dxa"/>
+          </w:tblCellMar>
+        </w:tblPrEx>
+        <w:trPr>
+          <w:cantSplit/>
+          <w:trHeight w:val="520"/>
+        </w:trPr>
+        <w:tc>
+          <w:tcPr>
+            <w:tcW w:w="700" w:type="dxa"/>
+            <w:tcBorders>
+              <w:top w:val="single" w:sz="4" w:space="0" w:color="B9C9CC"/>
+              <w:left w:val="single" w:sz="4" w:space="0" w:color="B9C9CC"/>
+              <w:bottom w:val="single" w:sz="4" w:space="0" w:color="B9C9CC"/>
+              <w:right w:val="single" w:sz="4" w:space="0" w:color="B9C9CC"/>
+            </w:tcBorders>
+            <w:shd w:val="clear" w:color="auto" w:fill="EAF3F2"/>
+            <w:tcMar>
+              <w:top w:w="80" w:type="dxa"/>
+              <w:left w:w="120" w:type="dxa"/>
+              <w:bottom w:w="80" w:type="dxa"/>
+              <w:right w:w="120" w:type="dxa"/>
+            </w:tcMar>
+          </w:tcPr>
+          <w:p>
+            <w:r>
+              <w:rPr>
+                <w:b/>
+                <w:bCs/>
+              </w:rPr>
+              <w:t>3</w:t>
+            </w:r>
+          </w:p>
+        </w:tc>
+        <w:tc>
+          <w:tcPr>
+            <w:tcW w:w="4500" w:type="dxa"/>
+            <w:tcBorders>
+              <w:top w:val="single" w:sz="4" w:space="0" w:color="B9C9CC"/>
+              <w:left w:val="single" w:sz="4" w:space="0" w:color="B9C9CC"/>
+              <w:bottom w:val="single" w:sz="4" w:space="0" w:color="B9C9CC"/>
+              <w:right w:val="single" w:sz="4" w:space="0" w:color="B9C9CC"/>
+            </w:tcBorders>
+            <w:tcMar>
+              <w:top w:w="80" w:type="dxa"/>
+              <w:left w:w="120" w:type="dxa"/>
+              <w:bottom w:w="80" w:type="dxa"/>
+              <w:right w:w="120" w:type="dxa"/>
+            </w:tcMar>
+          </w:tcPr>
+          <w:p/>
+        </w:tc>
+        <w:tc>
+          <w:tcPr>
+            <w:tcW w:w="4438" w:type="dxa"/>
+            <w:tcBorders>
+              <w:top w:val="single" w:sz="4" w:space="0" w:color="B9C9CC"/>
+              <w:left w:val="single" w:sz="4" w:space="0" w:color="B9C9CC"/>
+              <w:bottom w:val="single" w:sz="4" w:space="0" w:color="B9C9CC"/>
+              <w:right w:val="single" w:sz="4" w:space="0" w:color="B9C9CC"/>
+            </w:tcBorders>
+            <w:tcMar>
+              <w:top w:w="80" w:type="dxa"/>
+              <w:left w:w="120" w:type="dxa"/>
+              <w:bottom w:w="80" w:type="dxa"/>
+              <w:right w:w="120" w:type="dxa"/>
+            </w:tcMar>
+          </w:tcPr>
+          <w:p/>
+        </w:tc>
+      </w:tr>
+      <w:tr>
+        <w:tblPrEx>
+          <w:tblCellMar>
+            <w:top w:w="0" w:type="dxa"/>
+            <w:bottom w:w="0" w:type="dxa"/>
+          </w:tblCellMar>
+        </w:tblPrEx>
+        <w:trPr>
+          <w:cantSplit/>
+          <w:trHeight w:val="520"/>
+        </w:trPr>
+        <w:tc>
+          <w:tcPr>
+            <w:tcW w:w="700" w:type="dxa"/>
+            <w:tcBorders>
+              <w:top w:val="single" w:sz="4" w:space="0" w:color="B9C9CC"/>
+              <w:left w:val="single" w:sz="4" w:space="0" w:color="B9C9CC"/>
+              <w:bottom w:val="single" w:sz="4" w:space="0" w:color="B9C9CC"/>
+              <w:right w:val="single" w:sz="4" w:space="0" w:color="B9C9CC"/>
+            </w:tcBorders>
+            <w:shd w:val="clear" w:color="auto" w:fill="EAF3F2"/>
+            <w:tcMar>
+              <w:top w:w="80" w:type="dxa"/>
+              <w:left w:w="120" w:type="dxa"/>
+              <w:bottom w:w="80" w:type="dxa"/>
+              <w:right w:w="120" w:type="dxa"/>
+            </w:tcMar>
+          </w:tcPr>
+          <w:p>
+            <w:r>
+              <w:rPr>
+                <w:b/>
+                <w:bCs/>
+              </w:rPr>
+              <w:t>4</w:t>
+            </w:r>
+          </w:p>
+        </w:tc>
+        <w:tc>
+          <w:tcPr>
+            <w:tcW w:w="4500" w:type="dxa"/>
+            <w:tcBorders>
+              <w:top w:val="single" w:sz="4" w:space="0" w:color="B9C9CC"/>
+              <w:left w:val="single" w:sz="4" w:space="0" w:color="B9C9CC"/>
+              <w:bottom w:val="single" w:sz="4" w:space="0" w:color="B9C9CC"/>
+              <w:right w:val="single" w:sz="4" w:space="0" w:color="B9C9CC"/>
+            </w:tcBorders>
+            <w:tcMar>
+              <w:top w:w="80" w:type="dxa"/>
+              <w:left w:w="120" w:type="dxa"/>
+              <w:bottom w:w="80" w:type="dxa"/>
+              <w:right w:w="120" w:type="dxa"/>
+            </w:tcMar>
+          </w:tcPr>
+          <w:p/>
+        </w:tc>
+        <w:tc>
+          <w:tcPr>
+            <w:tcW w:w="4438" w:type="dxa"/>
+            <w:tcBorders>
+              <w:top w:val="single" w:sz="4" w:space="0" w:color="B9C9CC"/>
+              <w:left w:val="single" w:sz="4" w:space="0" w:color="B9C9CC"/>
+              <w:bottom w:val="single" w:sz="4" w:space="0" w:color="B9C9CC"/>
+              <w:right w:val="single" w:sz="4" w:space="0" w:color="B9C9CC"/>
+            </w:tcBorders>
+            <w:tcMar>
+              <w:top w:w="80" w:type="dxa"/>
+              <w:left w:w="120" w:type="dxa"/>
+              <w:bottom w:w="80" w:type="dxa"/>
+              <w:right w:w="120" w:type="dxa"/>
+            </w:tcMar>
+          </w:tcPr>
+          <w:p/>
+        </w:tc>
+      </w:tr>
+      <w:tr>
+        <w:tblPrEx>
+          <w:tblCellMar>
+            <w:top w:w="0" w:type="dxa"/>
+            <w:bottom w:w="0" w:type="dxa"/>
+          </w:tblCellMar>
+        </w:tblPrEx>
+        <w:trPr>
+          <w:cantSplit/>
+          <w:trHeight w:val="520"/>
+        </w:trPr>
+        <w:tc>
+          <w:tcPr>
+            <w:tcW w:w="700" w:type="dxa"/>
+            <w:tcBorders>
+              <w:top w:val="single" w:sz="4" w:space="0" w:color="B9C9CC"/>
+              <w:left w:val="single" w:sz="4" w:space="0" w:color="B9C9CC"/>
+              <w:bottom w:val="single" w:sz="4" w:space="0" w:color="B9C9CC"/>
+              <w:right w:val="single" w:sz="4" w:space="0" w:color="B9C9CC"/>
+            </w:tcBorders>
+            <w:shd w:val="clear" w:color="auto" w:fill="EAF3F2"/>
+            <w:tcMar>
+              <w:top w:w="80" w:type="dxa"/>
+              <w:left w:w="120" w:type="dxa"/>
+              <w:bottom w:w="80" w:type="dxa"/>
+              <w:right w:w="120" w:type="dxa"/>
+            </w:tcMar>
+          </w:tcPr>
+          <w:p>
+            <w:r>
+              <w:rPr>
+                <w:b/>
+                <w:bCs/>
+              </w:rPr>
+              <w:t>5</w:t>
+            </w:r>
+          </w:p>
+        </w:tc>
+        <w:tc>
+          <w:tcPr>
+            <w:tcW w:w="4500" w:type="dxa"/>
+            <w:tcBorders>
+              <w:top w:val="single" w:sz="4" w:space="0" w:color="B9C9CC"/>
+              <w:left w:val="single" w:sz="4" w:space="0" w:color="B9C9CC"/>
+              <w:bottom w:val="single" w:sz="4" w:space="0" w:color="B9C9CC"/>
+              <w:right w:val="single" w:sz="4" w:space="0" w:color="B9C9CC"/>
+            </w:tcBorders>
+            <w:tcMar>
+              <w:top w:w="80" w:type="dxa"/>
+              <w:left w:w="120" w:type="dxa"/>
+              <w:bottom w:w="80" w:type="dxa"/>
+              <w:right w:w="120" w:type="dxa"/>
+            </w:tcMar>
+          </w:tcPr>
+          <w:p/>
+        </w:tc>
+        <w:tc>
+          <w:tcPr>
+            <w:tcW w:w="4438" w:type="dxa"/>
+            <w:tcBorders>
+              <w:top w:val="single" w:sz="4" w:space="0" w:color="B9C9CC"/>
+              <w:left w:val="single" w:sz="4" w:space="0" w:color="B9C9CC"/>
+              <w:bottom w:val="single" w:sz="4" w:space="0" w:color="B9C9CC"/>
+              <w:right w:val="single" w:sz="4" w:space="0" w:color="B9C9CC"/>
+            </w:tcBorders>
+            <w:tcMar>
+              <w:top w:w="80" w:type="dxa"/>
+              <w:left w:w="120" w:type="dxa"/>
+              <w:bottom w:w="80" w:type="dxa"/>
+              <w:right w:w="120" w:type="dxa"/>
+            </w:tcMar>
+          </w:tcPr>
+          <w:p/>
+        </w:tc>
+      </w:tr>
+      <w:tr>
+        <w:tblPrEx>
+          <w:tblCellMar>
+            <w:top w:w="0" w:type="dxa"/>
+            <w:bottom w:w="0" w:type="dxa"/>
+          </w:tblCellMar>
+        </w:tblPrEx>
+        <w:trPr>
+          <w:cantSplit/>
+          <w:trHeight w:val="520"/>
+        </w:trPr>
+        <w:tc>
+          <w:tcPr>
+            <w:tcW w:w="700" w:type="dxa"/>
+            <w:tcBorders>
+              <w:top w:val="single" w:sz="4" w:space="0" w:color="B9C9CC"/>
+              <w:left w:val="single" w:sz="4" w:space="0" w:color="B9C9CC"/>
+              <w:bottom w:val="single" w:sz="4" w:space="0" w:color="B9C9CC"/>
+              <w:right w:val="single" w:sz="4" w:space="0" w:color="B9C9CC"/>
+            </w:tcBorders>
+            <w:shd w:val="clear" w:color="auto" w:fill="EAF3F2"/>
+            <w:tcMar>
+              <w:top w:w="80" w:type="dxa"/>
+              <w:left w:w="120" w:type="dxa"/>
+              <w:bottom w:w="80" w:type="dxa"/>
+              <w:right w:w="120" w:type="dxa"/>
+            </w:tcMar>
+          </w:tcPr>
+          <w:p>
+            <w:r>
+              <w:rPr>
+                <w:b/>
+                <w:bCs/>
+              </w:rPr>
+              <w:t>6</w:t>
+            </w:r>
+          </w:p>
+        </w:tc>
+        <w:tc>
+          <w:tcPr>
+            <w:tcW w:w="4500" w:type="dxa"/>
+            <w:tcBorders>
+              <w:top w:val="single" w:sz="4" w:space="0" w:color="B9C9CC"/>
+              <w:left w:val="single" w:sz="4" w:space="0" w:color="B9C9CC"/>
+              <w:bottom w:val="single" w:sz="4" w:space="0" w:color="B9C9CC"/>
+              <w:right w:val="single" w:sz="4" w:space="0" w:color="B9C9CC"/>
+            </w:tcBorders>
+            <w:tcMar>
+              <w:top w:w="80" w:type="dxa"/>
+              <w:left w:w="120" w:type="dxa"/>
+              <w:bottom w:w="80" w:type="dxa"/>
+              <w:right w:w="120" w:type="dxa"/>
+            </w:tcMar>
+          </w:tcPr>
+          <w:p/>
+        </w:tc>
+        <w:tc>
+          <w:tcPr>
+            <w:tcW w:w="4438" w:type="dxa"/>
+            <w:tcBorders>
+              <w:top w:val="single" w:sz="4" w:space="0" w:color="B9C9CC"/>
+              <w:left w:val="single" w:sz="4" w:space="0" w:color="B9C9CC"/>
+              <w:bottom w:val="single" w:sz="4" w:space="0" w:color="B9C9CC"/>
+              <w:right w:val="single" w:sz="4" w:space="0" w:color="B9C9CC"/>
+            </w:tcBorders>
+            <w:tcMar>
+              <w:top w:w="80" w:type="dxa"/>
+              <w:left w:w="120" w:type="dxa"/>
+              <w:bottom w:w="80" w:type="dxa"/>
+              <w:right w:w="120" w:type="dxa"/>
+            </w:tcMar>
+          </w:tcPr>
+          <w:p/>
+        </w:tc>
+      </w:tr>
+    </w:tbl>
+    <w:p>
+      <w:pPr>
+        <w:pStyle w:val="Titre3"/>
+      </w:pPr>
+      <w:r>
+        <w:t>Défi : faites attaquer votre question de recherche par l'IA en « jury sceptique » (3 objections), puis répondez-y.</w:t>
+      </w:r>
+    </w:p>
+    <w:tbl>
+      <w:tblPr>
+        <w:tblW w:w="9638" w:type="dxa"/>
+        <w:tblBorders>
+          <w:top w:val="single" w:sz="4" w:space="0" w:color="auto"/>
+          <w:left w:val="single" w:sz="4" w:space="0" w:color="auto"/>
+          <w:bottom w:val="single" w:sz="4" w:space="0" w:color="auto"/>
+          <w:right w:val="single" w:sz="4" w:space="0" w:color="auto"/>
+          <w:insideH w:val="single" w:sz="4" w:space="0" w:color="auto"/>
+          <w:insideV w:val="single" w:sz="4" w:space="0" w:color="auto"/>
+        </w:tblBorders>
+        <w:tblCellMar>
+          <w:left w:w="10" w:type="dxa"/>
+          <w:right w:w="10" w:type="dxa"/>
+        </w:tblCellMar>
+        <w:tblLook w:val="04A0" w:firstRow="1" w:lastRow="0" w:firstColumn="1" w:lastColumn="0" w:noHBand="0" w:noVBand="1"/>
+      </w:tblPr>
+      <w:tblGrid>
+        <w:gridCol w:w="4300"/>
+        <w:gridCol w:w="5338"/>
+      </w:tblGrid>
+      <w:tr>
+        <w:tblPrEx>
+          <w:tblCellMar>
+            <w:top w:w="0" w:type="dxa"/>
+            <w:bottom w:w="0" w:type="dxa"/>
+          </w:tblCellMar>
+        </w:tblPrEx>
+        <w:trPr>
+          <w:cantSplit/>
+          <w:tblHeader/>
+        </w:trPr>
+        <w:tc>
+          <w:tcPr>
+            <w:tcW w:w="4300" w:type="dxa"/>
+            <w:tcBorders>
+              <w:top w:val="single" w:sz="4" w:space="0" w:color="B9C9CC"/>
+              <w:left w:val="single" w:sz="4" w:space="0" w:color="B9C9CC"/>
+              <w:bottom w:val="single" w:sz="4" w:space="0" w:color="B9C9CC"/>
+              <w:right w:val="single" w:sz="4" w:space="0" w:color="B9C9CC"/>
+            </w:tcBorders>
+            <w:shd w:val="clear" w:color="auto" w:fill="0B3C49"/>
+            <w:tcMar>
+              <w:top w:w="80" w:type="dxa"/>
+              <w:left w:w="120" w:type="dxa"/>
+              <w:bottom w:w="80" w:type="dxa"/>
+              <w:right w:w="120" w:type="dxa"/>
+            </w:tcMar>
+          </w:tcPr>
+          <w:p>
+            <w:r>
+              <w:rPr>
+                <w:b/>
+                <w:bCs/>
+                <w:color w:val="FFFFFF"/>
+              </w:rPr>
+              <w:t>Objection du « jury »</w:t>
+            </w:r>
+          </w:p>
+        </w:tc>
+        <w:tc>
+          <w:tcPr>
+            <w:tcW w:w="5338" w:type="dxa"/>
+            <w:tcBorders>
+              <w:top w:val="single" w:sz="4" w:space="0" w:color="B9C9CC"/>
+              <w:left w:val="single" w:sz="4" w:space="0" w:color="B9C9CC"/>
+              <w:bottom w:val="single" w:sz="4" w:space="0" w:color="B9C9CC"/>
+              <w:right w:val="single" w:sz="4" w:space="0" w:color="B9C9CC"/>
+            </w:tcBorders>
+            <w:shd w:val="clear" w:color="auto" w:fill="0B3C49"/>
+            <w:tcMar>
+              <w:top w:w="80" w:type="dxa"/>
+              <w:left w:w="120" w:type="dxa"/>
+              <w:bottom w:w="80" w:type="dxa"/>
+              <w:right w:w="120" w:type="dxa"/>
+            </w:tcMar>
+          </w:tcPr>
+          <w:p>
+            <w:r>
+              <w:rPr>
+                <w:b/>
+                <w:bCs/>
+                <w:color w:val="FFFFFF"/>
+              </w:rPr>
+              <w:t>Ma réponse</w:t>
+            </w:r>
+          </w:p>
+        </w:tc>
+      </w:tr>
+      <w:tr>
+        <w:tblPrEx>
+          <w:tblCellMar>
+            <w:top w:w="0" w:type="dxa"/>
+            <w:bottom w:w="0" w:type="dxa"/>
+          </w:tblCellMar>
+        </w:tblPrEx>
+        <w:trPr>
+          <w:cantSplit/>
+          <w:trHeight w:val="700"/>
+        </w:trPr>
+        <w:tc>
+          <w:tcPr>
+            <w:tcW w:w="4300" w:type="dxa"/>
+            <w:tcBorders>
+              <w:top w:val="single" w:sz="4" w:space="0" w:color="B9C9CC"/>
+              <w:left w:val="single" w:sz="4" w:space="0" w:color="B9C9CC"/>
+              <w:bottom w:val="single" w:sz="4" w:space="0" w:color="B9C9CC"/>
+              <w:right w:val="single" w:sz="4" w:space="0" w:color="B9C9CC"/>
+            </w:tcBorders>
+            <w:shd w:val="clear" w:color="auto" w:fill="EAF3F2"/>
+            <w:tcMar>
+              <w:top w:w="80" w:type="dxa"/>
+              <w:left w:w="120" w:type="dxa"/>
+              <w:bottom w:w="80" w:type="dxa"/>
+              <w:right w:w="120" w:type="dxa"/>
+            </w:tcMar>
+          </w:tcPr>
+          <w:p>
+            <w:r>
+              <w:rPr>
+                <w:b/>
+                <w:bCs/>
+              </w:rPr>
+              <w:t>1.</w:t>
+            </w:r>
+          </w:p>
+        </w:tc>
+        <w:tc>
+          <w:tcPr>
+            <w:tcW w:w="5338" w:type="dxa"/>
+            <w:tcBorders>
+              <w:top w:val="single" w:sz="4" w:space="0" w:color="B9C9CC"/>
+              <w:left w:val="single" w:sz="4" w:space="0" w:color="B9C9CC"/>
+              <w:bottom w:val="single" w:sz="4" w:space="0" w:color="B9C9CC"/>
+              <w:right w:val="single" w:sz="4" w:space="0" w:color="B9C9CC"/>
+            </w:tcBorders>
+            <w:tcMar>
+              <w:top w:w="80" w:type="dxa"/>
+              <w:left w:w="120" w:type="dxa"/>
+              <w:bottom w:w="80" w:type="dxa"/>
+              <w:right w:w="120" w:type="dxa"/>
+            </w:tcMar>
+          </w:tcPr>
+          <w:p/>
+        </w:tc>
+      </w:tr>
+      <w:tr>
+        <w:tblPrEx>
+          <w:tblCellMar>
+            <w:top w:w="0" w:type="dxa"/>
+            <w:bottom w:w="0" w:type="dxa"/>
+          </w:tblCellMar>
+        </w:tblPrEx>
+        <w:trPr>
+          <w:cantSplit/>
+          <w:trHeight w:val="700"/>
+        </w:trPr>
+        <w:tc>
+          <w:tcPr>
+            <w:tcW w:w="4300" w:type="dxa"/>
+            <w:tcBorders>
+              <w:top w:val="single" w:sz="4" w:space="0" w:color="B9C9CC"/>
+              <w:left w:val="single" w:sz="4" w:space="0" w:color="B9C9CC"/>
+              <w:bottom w:val="single" w:sz="4" w:space="0" w:color="B9C9CC"/>
+              <w:right w:val="single" w:sz="4" w:space="0" w:color="B9C9CC"/>
+            </w:tcBorders>
+            <w:shd w:val="clear" w:color="auto" w:fill="EAF3F2"/>
+            <w:tcMar>
+              <w:top w:w="80" w:type="dxa"/>
+              <w:left w:w="120" w:type="dxa"/>
+              <w:bottom w:w="80" w:type="dxa"/>
+              <w:right w:w="120" w:type="dxa"/>
+            </w:tcMar>
+          </w:tcPr>
+          <w:p>
+            <w:r>
+              <w:rPr>
+                <w:b/>
+                <w:bCs/>
+              </w:rPr>
+              <w:lastRenderedPageBreak/>
+              <w:t>2.</w:t>
+            </w:r>
+          </w:p>
+        </w:tc>
+        <w:tc>
+          <w:tcPr>
+            <w:tcW w:w="5338" w:type="dxa"/>
+            <w:tcBorders>
+              <w:top w:val="single" w:sz="4" w:space="0" w:color="B9C9CC"/>
+              <w:left w:val="single" w:sz="4" w:space="0" w:color="B9C9CC"/>
+              <w:bottom w:val="single" w:sz="4" w:space="0" w:color="B9C9CC"/>
+              <w:right w:val="single" w:sz="4" w:space="0" w:color="B9C9CC"/>
+            </w:tcBorders>
+            <w:tcMar>
+              <w:top w:w="80" w:type="dxa"/>
+              <w:left w:w="120" w:type="dxa"/>
+              <w:bottom w:w="80" w:type="dxa"/>
+              <w:right w:w="120" w:type="dxa"/>
+            </w:tcMar>
+          </w:tcPr>
+          <w:p/>
+        </w:tc>
+      </w:tr>
+      <w:tr>
+        <w:tblPrEx>
+          <w:tblCellMar>
+            <w:top w:w="0" w:type="dxa"/>
+            <w:bottom w:w="0" w:type="dxa"/>
+          </w:tblCellMar>
+        </w:tblPrEx>
+        <w:trPr>
+          <w:cantSplit/>
+          <w:trHeight w:val="700"/>
+        </w:trPr>
+        <w:tc>
+          <w:tcPr>
+            <w:tcW w:w="4300" w:type="dxa"/>
+            <w:tcBorders>
+              <w:top w:val="single" w:sz="4" w:space="0" w:color="B9C9CC"/>
+              <w:left w:val="single" w:sz="4" w:space="0" w:color="B9C9CC"/>
+              <w:bottom w:val="single" w:sz="4" w:space="0" w:color="B9C9CC"/>
+              <w:right w:val="single" w:sz="4" w:space="0" w:color="B9C9CC"/>
+            </w:tcBorders>
+            <w:shd w:val="clear" w:color="auto" w:fill="EAF3F2"/>
+            <w:tcMar>
+              <w:top w:w="80" w:type="dxa"/>
+              <w:left w:w="120" w:type="dxa"/>
+              <w:bottom w:w="80" w:type="dxa"/>
+              <w:right w:w="120" w:type="dxa"/>
+            </w:tcMar>
+          </w:tcPr>
+          <w:p>
+            <w:r>
+              <w:rPr>
+                <w:b/>
+                <w:bCs/>
+              </w:rPr>
+              <w:t>3.</w:t>
+            </w:r>
+          </w:p>
+        </w:tc>
+        <w:tc>
+          <w:tcPr>
+            <w:tcW w:w="5338" w:type="dxa"/>
+            <w:tcBorders>
+              <w:top w:val="single" w:sz="4" w:space="0" w:color="B9C9CC"/>
+              <w:left w:val="single" w:sz="4" w:space="0" w:color="B9C9CC"/>
+              <w:bottom w:val="single" w:sz="4" w:space="0" w:color="B9C9CC"/>
+              <w:right w:val="single" w:sz="4" w:space="0" w:color="B9C9CC"/>
+            </w:tcBorders>
+            <w:tcMar>
+              <w:top w:w="80" w:type="dxa"/>
+              <w:left w:w="120" w:type="dxa"/>
+              <w:bottom w:w="80" w:type="dxa"/>
+              <w:right w:w="120" w:type="dxa"/>
+            </w:tcMar>
+          </w:tcPr>
+          <w:p/>
+        </w:tc>
+      </w:tr>
+    </w:tbl>
+    <w:p>
+      <w:pPr>
+        <w:pStyle w:val="Titre1"/>
+        <w:pageBreakBefore/>
+      </w:pPr>
+      <w:r>
+        <w:lastRenderedPageBreak/>
+        <w:t>Fiche 1 · Rédaction scientifique</w:t>
+      </w:r>
+    </w:p>
+    <w:p>
+      <w:r>
+        <w:rPr>
+          <w:i/>
+          <w:iCs/>
+          <w:color w:val="6B7C82"/>
+        </w:rPr>
+        <w:t>Durée : 45 min · Matériau : votre résumé de thèse ou un paragraphe de votre état de l'art · Repli : CORPUS-LABS / 0-Pack-commun / Resume_these.docx</w:t>
+      </w:r>
+    </w:p>
+    <w:tbl>
+      <w:tblPr>
+        <w:tblW w:w="9638" w:type="dxa"/>
+        <w:tblBorders>
+          <w:top w:val="single" w:sz="4" w:space="0" w:color="auto"/>
+          <w:left w:val="single" w:sz="4" w:space="0" w:color="auto"/>
+          <w:bottom w:val="single" w:sz="4" w:space="0" w:color="auto"/>
+          <w:right w:val="single" w:sz="4" w:space="0" w:color="auto"/>
+          <w:insideH w:val="single" w:sz="4" w:space="0" w:color="auto"/>
+          <w:insideV w:val="single" w:sz="4" w:space="0" w:color="auto"/>
+        </w:tblBorders>
+        <w:tblCellMar>
+          <w:left w:w="10" w:type="dxa"/>
+          <w:right w:w="10" w:type="dxa"/>
+        </w:tblCellMar>
+        <w:tblLook w:val="04A0" w:firstRow="1" w:lastRow="0" w:firstColumn="1" w:lastColumn="0" w:noHBand="0" w:noVBand="1"/>
+      </w:tblPr>
+      <w:tblGrid>
+        <w:gridCol w:w="9638"/>
+      </w:tblGrid>
+      <w:tr>
+        <w:tblPrEx>
+          <w:tblCellMar>
+            <w:top w:w="0" w:type="dxa"/>
+            <w:bottom w:w="0" w:type="dxa"/>
+          </w:tblCellMar>
+        </w:tblPrEx>
+        <w:trPr>
+          <w:cantSplit/>
+        </w:trPr>
+        <w:tc>
+          <w:tcPr>
+            <w:tcW w:w="9638" w:type="dxa"/>
+            <w:tcBorders>
+              <w:top w:val="none" w:sz="0" w:space="0" w:color="FFFFFF"/>
+              <w:left w:val="none" w:sz="0" w:space="0" w:color="FFFFFF"/>
+              <w:bottom w:val="none" w:sz="0" w:space="0" w:color="FFFFFF"/>
+              <w:right w:val="none" w:sz="0" w:space="0" w:color="FFFFFF"/>
+            </w:tcBorders>
+            <w:shd w:val="clear" w:color="auto" w:fill="EAF3F2"/>
+            <w:tcMar>
+              <w:top w:w="140" w:type="dxa"/>
+              <w:left w:w="200" w:type="dxa"/>
+              <w:bottom w:w="140" w:type="dxa"/>
+              <w:right w:w="200" w:type="dxa"/>
+            </w:tcMar>
+          </w:tcPr>
+          <w:p>
+            <w:r>
+              <w:rPr>
+                <w:b/>
+                <w:bCs/>
+                <w:color w:val="0B3C49"/>
+              </w:rPr>
+              <w:t>Consigne</w:t>
+            </w:r>
+          </w:p>
+          <w:p>
+            <w:pPr>
+              <w:pStyle w:val="Paragraphedeliste"/>
+              <w:numPr>
+                <w:ilvl w:val="0"/>
+                <w:numId w:val="7"/>
+              </w:numPr>
+            </w:pPr>
+            <w:r>
+              <w:t>Ouvrez votre résumé de thèse ou un paragraphe de votre état de l'art. Sans texte personnel, prenez le résumé de thèse fictif du pack commun (Resume_these.docx) : il contient des erreurs volontaires.</w:t>
+            </w:r>
+          </w:p>
+          <w:p>
+            <w:pPr>
+              <w:pStyle w:val="Paragraphedeliste"/>
+              <w:numPr>
+                <w:ilvl w:val="0"/>
+                <w:numId w:val="7"/>
+              </w:numPr>
+            </w:pPr>
+            <w:r>
+              <w:t>Rédigez un prompt R-C-T-F + règles pour obtenir un résumé structuré de 250 mots (IMRaD pour un article).</w:t>
+            </w:r>
+          </w:p>
+          <w:p>
+            <w:pPr>
+              <w:pStyle w:val="Paragraphedeliste"/>
+              <w:numPr>
+                <w:ilvl w:val="0"/>
+                <w:numId w:val="7"/>
+              </w:numPr>
+            </w:pPr>
+            <w:r>
+              <w:t>Améliorez le résultat en au moins 2 itérations.</w:t>
+            </w:r>
+          </w:p>
+          <w:p>
+            <w:pPr>
+              <w:pStyle w:val="Paragraphedeliste"/>
+              <w:numPr>
+                <w:ilvl w:val="0"/>
+                <w:numId w:val="7"/>
+              </w:numPr>
+            </w:pPr>
+            <w:r>
+              <w:t>Demandez à l'IA de jouer un relecteur exigeant : relevez 3 critiques et répondez à chacune, comme à un reviewer.</w:t>
+            </w:r>
+          </w:p>
+          <w:p>
+            <w:pPr>
+              <w:pStyle w:val="Paragraphedeliste"/>
+              <w:numPr>
+                <w:ilvl w:val="0"/>
+                <w:numId w:val="7"/>
               </w:numPr>
             </w:pPr>
             <w:r>
@@ -3900,6 +6984,7 @@
         <w:pStyle w:val="Titre2"/>
       </w:pPr>
       <w:r>
+        <w:lastRenderedPageBreak/>
         <w:t>Les critiques du relecteur IA</w:t>
       </w:r>
     </w:p>
@@ -4680,6 +7765,7 @@
         <w:pStyle w:val="Titre2"/>
       </w:pPr>
       <w:r>
+        <w:lastRenderedPageBreak/>
         <w:t>Mon résumé final (250 mots)</w:t>
       </w:r>
     </w:p>
@@ -5021,6 +8107,7 @@
         <w:pageBreakBefore/>
       </w:pPr>
       <w:r>
+        <w:lastRenderedPageBreak/>
         <w:t>Fiche 2 · Un RAG sur votre bibliographie</w:t>
       </w:r>
     </w:p>
@@ -5096,7 +8183,7 @@
               <w:pStyle w:val="Paragraphedeliste"/>
               <w:numPr>
                 <w:ilvl w:val="0"/>
-                <w:numId w:val="7"/>
+                <w:numId w:val="8"/>
               </w:numPr>
             </w:pPr>
             <w:r>
@@ -5108,7 +8195,7 @@
               <w:pStyle w:val="Paragraphedeliste"/>
               <w:numPr>
                 <w:ilvl w:val="0"/>
-                <w:numId w:val="7"/>
+                <w:numId w:val="8"/>
               </w:numPr>
             </w:pPr>
             <w:r>
@@ -5120,7 +8207,7 @@
               <w:pStyle w:val="Paragraphedeliste"/>
               <w:numPr>
                 <w:ilvl w:val="0"/>
-                <w:numId w:val="7"/>
+                <w:numId w:val="8"/>
               </w:numPr>
             </w:pPr>
             <w:r>
@@ -5132,7 +8219,7 @@
               <w:pStyle w:val="Paragraphedeliste"/>
               <w:numPr>
                 <w:ilvl w:val="0"/>
-                <w:numId w:val="7"/>
+                <w:numId w:val="8"/>
               </w:numPr>
             </w:pPr>
             <w:r>
@@ -5144,7 +8231,7 @@
               <w:pStyle w:val="Paragraphedeliste"/>
               <w:numPr>
                 <w:ilvl w:val="0"/>
-                <w:numId w:val="7"/>
+                <w:numId w:val="8"/>
               </w:numPr>
             </w:pPr>
             <w:r>
@@ -5156,7 +8243,7 @@
               <w:pStyle w:val="Paragraphedeliste"/>
               <w:numPr>
                 <w:ilvl w:val="0"/>
-                <w:numId w:val="7"/>
+                <w:numId w:val="8"/>
               </w:numPr>
             </w:pPr>
             <w:r>
@@ -5676,6 +8763,7 @@
         <w:pStyle w:val="Titre2"/>
       </w:pPr>
       <w:r>
+        <w:lastRenderedPageBreak/>
         <w:t>Mes questions</w:t>
       </w:r>
     </w:p>
@@ -6654,6 +9742,7 @@
                 <w:b/>
                 <w:bCs/>
               </w:rPr>
+              <w:lastRenderedPageBreak/>
               <w:t>5</w:t>
             </w:r>
           </w:p>
@@ -7484,6 +10573,7 @@
         <w:pageBreakBefore/>
       </w:pPr>
       <w:r>
+        <w:lastRenderedPageBreak/>
         <w:t>Fiche 3 · Analyse qualitative</w:t>
       </w:r>
     </w:p>
@@ -7494,7 +10584,7 @@
           <w:iCs/>
           <w:color w:val="6B7C82"/>
         </w:rPr>
-        <w:t>Durée : 55 min · Outil : Gemini Notebook · Corpus : CORPUS-LABS / votre piste / Entretien_…</w:t>
+        <w:t>Durée : 50 min · Outil : Gemini Notebook · Corpus : CORPUS-LABS / votre piste / Entretien_…</w:t>
       </w:r>
     </w:p>
     <w:tbl>
@@ -7559,7 +10649,7 @@
               <w:pStyle w:val="Paragraphedeliste"/>
               <w:numPr>
                 <w:ilvl w:val="0"/>
-                <w:numId w:val="8"/>
+                <w:numId w:val="9"/>
               </w:numPr>
             </w:pPr>
             <w:r>
@@ -7571,7 +10661,7 @@
               <w:pStyle w:val="Paragraphedeliste"/>
               <w:numPr>
                 <w:ilvl w:val="0"/>
-                <w:numId w:val="8"/>
+                <w:numId w:val="9"/>
               </w:numPr>
             </w:pPr>
             <w:r>
@@ -7583,7 +10673,7 @@
               <w:pStyle w:val="Paragraphedeliste"/>
               <w:numPr>
                 <w:ilvl w:val="0"/>
-                <w:numId w:val="8"/>
+                <w:numId w:val="9"/>
               </w:numPr>
             </w:pPr>
             <w:r>
@@ -7595,7 +10685,7 @@
               <w:pStyle w:val="Paragraphedeliste"/>
               <w:numPr>
                 <w:ilvl w:val="0"/>
-                <w:numId w:val="8"/>
+                <w:numId w:val="9"/>
               </w:numPr>
             </w:pPr>
             <w:r>
@@ -7607,7 +10697,7 @@
               <w:pStyle w:val="Paragraphedeliste"/>
               <w:numPr>
                 <w:ilvl w:val="0"/>
-                <w:numId w:val="8"/>
+                <w:numId w:val="9"/>
               </w:numPr>
             </w:pPr>
             <w:r>
@@ -9217,6 +12307,7 @@
         <w:pStyle w:val="Titre3"/>
       </w:pPr>
       <w:r>
+        <w:lastRenderedPageBreak/>
         <w:t>Défi : ajoutez votre grille de codage comme source, puis demandez à l'IA de l'appliquer à chaque entretien.</w:t>
       </w:r>
     </w:p>
@@ -9290,6 +12381,7 @@
         <w:pageBreakBefore/>
       </w:pPr>
       <w:r>
+        <w:lastRenderedPageBreak/>
         <w:t>Fiche 4 · Traduction FR → EN</w:t>
       </w:r>
     </w:p>
@@ -9365,7 +12457,7 @@
               <w:pStyle w:val="Paragraphedeliste"/>
               <w:numPr>
                 <w:ilvl w:val="0"/>
-                <w:numId w:val="9"/>
+                <w:numId w:val="10"/>
               </w:numPr>
             </w:pPr>
             <w:r>
@@ -9377,7 +12469,7 @@
               <w:pStyle w:val="Paragraphedeliste"/>
               <w:numPr>
                 <w:ilvl w:val="0"/>
-                <w:numId w:val="9"/>
+                <w:numId w:val="10"/>
               </w:numPr>
             </w:pPr>
             <w:r>
@@ -9389,7 +12481,7 @@
               <w:pStyle w:val="Paragraphedeliste"/>
               <w:numPr>
                 <w:ilvl w:val="0"/>
-                <w:numId w:val="9"/>
+                <w:numId w:val="10"/>
               </w:numPr>
             </w:pPr>
             <w:r>
@@ -9401,7 +12493,7 @@
               <w:pStyle w:val="Paragraphedeliste"/>
               <w:numPr>
                 <w:ilvl w:val="0"/>
-                <w:numId w:val="9"/>
+                <w:numId w:val="10"/>
               </w:numPr>
             </w:pPr>
             <w:r>
@@ -10279,6 +13371,7 @@
         <w:pStyle w:val="Titre2"/>
       </w:pPr>
       <w:r>
+        <w:lastRenderedPageBreak/>
         <w:t>Écarts repérés par la rétro-traduction</w:t>
       </w:r>
     </w:p>
@@ -10755,6 +13848,7 @@
         <w:pStyle w:val="Titre3"/>
       </w:pPr>
       <w:r>
+        <w:lastRenderedPageBreak/>
         <w:t>Défi : adaptez l'abstract aux consignes d'une revue ciblée et rédigez la lettre de soumission.</w:t>
       </w:r>
     </w:p>
@@ -10827,6 +13921,7 @@
         <w:pageBreakBefore/>
       </w:pPr>
       <w:r>
+        <w:lastRenderedPageBreak/>
         <w:t>Fiche 5 · Assistant ou agent : à vous de piloter</w:t>
       </w:r>
     </w:p>
@@ -10837,7 +13932,7 @@
           <w:iCs/>
           <w:color w:val="6B7C82"/>
         </w:rPr>
-        <w:t>Durée : 30 min · Choisissez l'option A ou l'option B (ou les deux pour le Défi)</w:t>
+        <w:t>Durée : 35 min · Choisissez l'option A ou l'option B (ou les deux pour le Défi)</w:t>
       </w:r>
     </w:p>
     <w:p>
@@ -11468,7 +14563,7 @@
               <w:pStyle w:val="Paragraphedeliste"/>
               <w:numPr>
                 <w:ilvl w:val="0"/>
-                <w:numId w:val="10"/>
+                <w:numId w:val="11"/>
               </w:numPr>
             </w:pPr>
             <w:r>
@@ -11480,7 +14575,7 @@
               <w:pStyle w:val="Paragraphedeliste"/>
               <w:numPr>
                 <w:ilvl w:val="0"/>
-                <w:numId w:val="10"/>
+                <w:numId w:val="11"/>
               </w:numPr>
             </w:pPr>
             <w:r>
@@ -11492,7 +14587,7 @@
               <w:pStyle w:val="Paragraphedeliste"/>
               <w:numPr>
                 <w:ilvl w:val="0"/>
-                <w:numId w:val="10"/>
+                <w:numId w:val="11"/>
               </w:numPr>
             </w:pPr>
             <w:r>
@@ -11535,6 +14630,7 @@
                 <w:bCs/>
                 <w:color w:val="0B3C49"/>
               </w:rPr>
+              <w:lastRenderedPageBreak/>
               <w:t>Mon objectif, tel que formulé :</w:t>
             </w:r>
           </w:p>
@@ -12556,6 +15652,7 @@
           <w:sz w:val="17"/>
           <w:szCs w:val="17"/>
         </w:rPr>
+        <w:lastRenderedPageBreak/>
         <w:t xml:space="preserve">Exemple de déclaration : </w:t>
       </w:r>
       <w:r>
@@ -12992,6 +16089,7 @@
         <w:pageBreakBefore/>
       </w:pPr>
       <w:r>
+        <w:lastRenderedPageBreak/>
         <w:t>Annexe 1 · Le pack commun et les documents pour aller plus loin</w:t>
       </w:r>
     </w:p>
@@ -13413,6 +16511,7 @@
           <w:b/>
           <w:bCs/>
         </w:rPr>
+        <w:lastRenderedPageBreak/>
         <w:t xml:space="preserve">10. Boukar &amp; Mal Ibrahima (2020). </w:t>
       </w:r>
       <w:r>
@@ -13769,6 +16868,7 @@
         <w:pageBreakBefore/>
       </w:pPr>
       <w:r>
+        <w:lastRenderedPageBreak/>
         <w:t>Annexe 2 · Annuaire des outils</w:t>
       </w:r>
     </w:p>
@@ -14484,10 +17584,10 @@
         <w:tblLook w:val="04A0" w:firstRow="1" w:lastRow="0" w:firstColumn="1" w:lastColumn="0" w:noHBand="0" w:noVBand="1"/>
       </w:tblPr>
       <w:tblGrid>
-        <w:gridCol w:w="1991"/>
-        <w:gridCol w:w="2415"/>
-        <w:gridCol w:w="3734"/>
-        <w:gridCol w:w="1498"/>
+        <w:gridCol w:w="1988"/>
+        <w:gridCol w:w="2461"/>
+        <w:gridCol w:w="3692"/>
+        <w:gridCol w:w="1497"/>
       </w:tblGrid>
       <w:tr>
         <w:tblPrEx>
@@ -15062,6 +18162,7 @@
                 <w:b/>
                 <w:bCs/>
               </w:rPr>
+              <w:lastRenderedPageBreak/>
               <w:t>Connected Papers</w:t>
             </w:r>
           </w:p>
@@ -15582,6 +18683,422 @@
                 <w:b/>
                 <w:bCs/>
               </w:rPr>
+              <w:t>Retraction Watch Database</w:t>
+            </w:r>
+          </w:p>
+        </w:tc>
+        <w:tc>
+          <w:tcPr>
+            <w:tcW w:w="2300" w:type="dxa"/>
+            <w:tcBorders>
+              <w:top w:val="single" w:sz="4" w:space="0" w:color="B9C9CC"/>
+              <w:left w:val="single" w:sz="4" w:space="0" w:color="B9C9CC"/>
+              <w:bottom w:val="single" w:sz="4" w:space="0" w:color="B9C9CC"/>
+              <w:right w:val="single" w:sz="4" w:space="0" w:color="B9C9CC"/>
+            </w:tcBorders>
+            <w:tcMar>
+              <w:top w:w="80" w:type="dxa"/>
+              <w:left w:w="120" w:type="dxa"/>
+              <w:bottom w:w="80" w:type="dxa"/>
+              <w:right w:w="120" w:type="dxa"/>
+            </w:tcMar>
+          </w:tcPr>
+          <w:p>
+            <w:r>
+              <w:t>retractiondatabase.org</w:t>
+            </w:r>
+          </w:p>
+        </w:tc>
+        <w:tc>
+          <w:tcPr>
+            <w:tcW w:w="3838" w:type="dxa"/>
+            <w:tcBorders>
+              <w:top w:val="single" w:sz="4" w:space="0" w:color="B9C9CC"/>
+              <w:left w:val="single" w:sz="4" w:space="0" w:color="B9C9CC"/>
+              <w:bottom w:val="single" w:sz="4" w:space="0" w:color="B9C9CC"/>
+              <w:right w:val="single" w:sz="4" w:space="0" w:color="B9C9CC"/>
+            </w:tcBorders>
+            <w:tcMar>
+              <w:top w:w="80" w:type="dxa"/>
+              <w:left w:w="120" w:type="dxa"/>
+              <w:bottom w:w="80" w:type="dxa"/>
+              <w:right w:w="120" w:type="dxa"/>
+            </w:tcMar>
+          </w:tcPr>
+          <w:p>
+            <w:r>
+              <w:t>Vérifier si un article a été rétracté.</w:t>
+            </w:r>
+          </w:p>
+        </w:tc>
+        <w:tc>
+          <w:tcPr>
+            <w:tcW w:w="1500" w:type="dxa"/>
+            <w:tcBorders>
+              <w:top w:val="single" w:sz="4" w:space="0" w:color="B9C9CC"/>
+              <w:left w:val="single" w:sz="4" w:space="0" w:color="B9C9CC"/>
+              <w:bottom w:val="single" w:sz="4" w:space="0" w:color="B9C9CC"/>
+              <w:right w:val="single" w:sz="4" w:space="0" w:color="B9C9CC"/>
+            </w:tcBorders>
+            <w:tcMar>
+              <w:top w:w="80" w:type="dxa"/>
+              <w:left w:w="120" w:type="dxa"/>
+              <w:bottom w:w="80" w:type="dxa"/>
+              <w:right w:w="120" w:type="dxa"/>
+            </w:tcMar>
+          </w:tcPr>
+          <w:p>
+            <w:r>
+              <w:t>Gratuit</w:t>
+            </w:r>
+          </w:p>
+        </w:tc>
+      </w:tr>
+      <w:tr>
+        <w:tblPrEx>
+          <w:tblCellMar>
+            <w:top w:w="0" w:type="dxa"/>
+            <w:bottom w:w="0" w:type="dxa"/>
+          </w:tblCellMar>
+        </w:tblPrEx>
+        <w:trPr>
+          <w:cantSplit/>
+        </w:trPr>
+        <w:tc>
+          <w:tcPr>
+            <w:tcW w:w="2000" w:type="dxa"/>
+            <w:tcBorders>
+              <w:top w:val="single" w:sz="4" w:space="0" w:color="B9C9CC"/>
+              <w:left w:val="single" w:sz="4" w:space="0" w:color="B9C9CC"/>
+              <w:bottom w:val="single" w:sz="4" w:space="0" w:color="B9C9CC"/>
+              <w:right w:val="single" w:sz="4" w:space="0" w:color="B9C9CC"/>
+            </w:tcBorders>
+            <w:shd w:val="clear" w:color="auto" w:fill="EAF3F2"/>
+            <w:tcMar>
+              <w:top w:w="80" w:type="dxa"/>
+              <w:left w:w="120" w:type="dxa"/>
+              <w:bottom w:w="80" w:type="dxa"/>
+              <w:right w:w="120" w:type="dxa"/>
+            </w:tcMar>
+          </w:tcPr>
+          <w:p>
+            <w:r>
+              <w:rPr>
+                <w:b/>
+                <w:bCs/>
+              </w:rPr>
+              <w:t>PubPeer</w:t>
+            </w:r>
+          </w:p>
+        </w:tc>
+        <w:tc>
+          <w:tcPr>
+            <w:tcW w:w="2300" w:type="dxa"/>
+            <w:tcBorders>
+              <w:top w:val="single" w:sz="4" w:space="0" w:color="B9C9CC"/>
+              <w:left w:val="single" w:sz="4" w:space="0" w:color="B9C9CC"/>
+              <w:bottom w:val="single" w:sz="4" w:space="0" w:color="B9C9CC"/>
+              <w:right w:val="single" w:sz="4" w:space="0" w:color="B9C9CC"/>
+            </w:tcBorders>
+            <w:tcMar>
+              <w:top w:w="80" w:type="dxa"/>
+              <w:left w:w="120" w:type="dxa"/>
+              <w:bottom w:w="80" w:type="dxa"/>
+              <w:right w:w="120" w:type="dxa"/>
+            </w:tcMar>
+          </w:tcPr>
+          <w:p>
+            <w:r>
+              <w:t>pubpeer.com</w:t>
+            </w:r>
+          </w:p>
+        </w:tc>
+        <w:tc>
+          <w:tcPr>
+            <w:tcW w:w="3838" w:type="dxa"/>
+            <w:tcBorders>
+              <w:top w:val="single" w:sz="4" w:space="0" w:color="B9C9CC"/>
+              <w:left w:val="single" w:sz="4" w:space="0" w:color="B9C9CC"/>
+              <w:bottom w:val="single" w:sz="4" w:space="0" w:color="B9C9CC"/>
+              <w:right w:val="single" w:sz="4" w:space="0" w:color="B9C9CC"/>
+            </w:tcBorders>
+            <w:tcMar>
+              <w:top w:w="80" w:type="dxa"/>
+              <w:left w:w="120" w:type="dxa"/>
+              <w:bottom w:w="80" w:type="dxa"/>
+              <w:right w:w="120" w:type="dxa"/>
+            </w:tcMar>
+          </w:tcPr>
+          <w:p>
+            <w:r>
+              <w:t>Lire les critiques publiées par d'autres chercheurs sur un article.</w:t>
+            </w:r>
+          </w:p>
+        </w:tc>
+        <w:tc>
+          <w:tcPr>
+            <w:tcW w:w="1500" w:type="dxa"/>
+            <w:tcBorders>
+              <w:top w:val="single" w:sz="4" w:space="0" w:color="B9C9CC"/>
+              <w:left w:val="single" w:sz="4" w:space="0" w:color="B9C9CC"/>
+              <w:bottom w:val="single" w:sz="4" w:space="0" w:color="B9C9CC"/>
+              <w:right w:val="single" w:sz="4" w:space="0" w:color="B9C9CC"/>
+            </w:tcBorders>
+            <w:tcMar>
+              <w:top w:w="80" w:type="dxa"/>
+              <w:left w:w="120" w:type="dxa"/>
+              <w:bottom w:w="80" w:type="dxa"/>
+              <w:right w:w="120" w:type="dxa"/>
+            </w:tcMar>
+          </w:tcPr>
+          <w:p>
+            <w:r>
+              <w:t>Gratuit</w:t>
+            </w:r>
+          </w:p>
+        </w:tc>
+      </w:tr>
+      <w:tr>
+        <w:tblPrEx>
+          <w:tblCellMar>
+            <w:top w:w="0" w:type="dxa"/>
+            <w:bottom w:w="0" w:type="dxa"/>
+          </w:tblCellMar>
+        </w:tblPrEx>
+        <w:trPr>
+          <w:cantSplit/>
+        </w:trPr>
+        <w:tc>
+          <w:tcPr>
+            <w:tcW w:w="2000" w:type="dxa"/>
+            <w:tcBorders>
+              <w:top w:val="single" w:sz="4" w:space="0" w:color="B9C9CC"/>
+              <w:left w:val="single" w:sz="4" w:space="0" w:color="B9C9CC"/>
+              <w:bottom w:val="single" w:sz="4" w:space="0" w:color="B9C9CC"/>
+              <w:right w:val="single" w:sz="4" w:space="0" w:color="B9C9CC"/>
+            </w:tcBorders>
+            <w:shd w:val="clear" w:color="auto" w:fill="EAF3F2"/>
+            <w:tcMar>
+              <w:top w:w="80" w:type="dxa"/>
+              <w:left w:w="120" w:type="dxa"/>
+              <w:bottom w:w="80" w:type="dxa"/>
+              <w:right w:w="120" w:type="dxa"/>
+            </w:tcMar>
+          </w:tcPr>
+          <w:p>
+            <w:r>
+              <w:rPr>
+                <w:b/>
+                <w:bCs/>
+              </w:rPr>
+              <w:t>DOAJ</w:t>
+            </w:r>
+          </w:p>
+        </w:tc>
+        <w:tc>
+          <w:tcPr>
+            <w:tcW w:w="2300" w:type="dxa"/>
+            <w:tcBorders>
+              <w:top w:val="single" w:sz="4" w:space="0" w:color="B9C9CC"/>
+              <w:left w:val="single" w:sz="4" w:space="0" w:color="B9C9CC"/>
+              <w:bottom w:val="single" w:sz="4" w:space="0" w:color="B9C9CC"/>
+              <w:right w:val="single" w:sz="4" w:space="0" w:color="B9C9CC"/>
+            </w:tcBorders>
+            <w:tcMar>
+              <w:top w:w="80" w:type="dxa"/>
+              <w:left w:w="120" w:type="dxa"/>
+              <w:bottom w:w="80" w:type="dxa"/>
+              <w:right w:w="120" w:type="dxa"/>
+            </w:tcMar>
+          </w:tcPr>
+          <w:p>
+            <w:r>
+              <w:t>doaj.org</w:t>
+            </w:r>
+          </w:p>
+        </w:tc>
+        <w:tc>
+          <w:tcPr>
+            <w:tcW w:w="3838" w:type="dxa"/>
+            <w:tcBorders>
+              <w:top w:val="single" w:sz="4" w:space="0" w:color="B9C9CC"/>
+              <w:left w:val="single" w:sz="4" w:space="0" w:color="B9C9CC"/>
+              <w:bottom w:val="single" w:sz="4" w:space="0" w:color="B9C9CC"/>
+              <w:right w:val="single" w:sz="4" w:space="0" w:color="B9C9CC"/>
+            </w:tcBorders>
+            <w:tcMar>
+              <w:top w:w="80" w:type="dxa"/>
+              <w:left w:w="120" w:type="dxa"/>
+              <w:bottom w:w="80" w:type="dxa"/>
+              <w:right w:w="120" w:type="dxa"/>
+            </w:tcMar>
+          </w:tcPr>
+          <w:p>
+            <w:r>
+              <w:t>Vérifier qu'une revue en libre accès est reconnue (annuaire des revues ouvertes).</w:t>
+            </w:r>
+          </w:p>
+        </w:tc>
+        <w:tc>
+          <w:tcPr>
+            <w:tcW w:w="1500" w:type="dxa"/>
+            <w:tcBorders>
+              <w:top w:val="single" w:sz="4" w:space="0" w:color="B9C9CC"/>
+              <w:left w:val="single" w:sz="4" w:space="0" w:color="B9C9CC"/>
+              <w:bottom w:val="single" w:sz="4" w:space="0" w:color="B9C9CC"/>
+              <w:right w:val="single" w:sz="4" w:space="0" w:color="B9C9CC"/>
+            </w:tcBorders>
+            <w:tcMar>
+              <w:top w:w="80" w:type="dxa"/>
+              <w:left w:w="120" w:type="dxa"/>
+              <w:bottom w:w="80" w:type="dxa"/>
+              <w:right w:w="120" w:type="dxa"/>
+            </w:tcMar>
+          </w:tcPr>
+          <w:p>
+            <w:r>
+              <w:t>Gratuit</w:t>
+            </w:r>
+          </w:p>
+        </w:tc>
+      </w:tr>
+      <w:tr>
+        <w:tblPrEx>
+          <w:tblCellMar>
+            <w:top w:w="0" w:type="dxa"/>
+            <w:bottom w:w="0" w:type="dxa"/>
+          </w:tblCellMar>
+        </w:tblPrEx>
+        <w:trPr>
+          <w:cantSplit/>
+        </w:trPr>
+        <w:tc>
+          <w:tcPr>
+            <w:tcW w:w="2000" w:type="dxa"/>
+            <w:tcBorders>
+              <w:top w:val="single" w:sz="4" w:space="0" w:color="B9C9CC"/>
+              <w:left w:val="single" w:sz="4" w:space="0" w:color="B9C9CC"/>
+              <w:bottom w:val="single" w:sz="4" w:space="0" w:color="B9C9CC"/>
+              <w:right w:val="single" w:sz="4" w:space="0" w:color="B9C9CC"/>
+            </w:tcBorders>
+            <w:shd w:val="clear" w:color="auto" w:fill="EAF3F2"/>
+            <w:tcMar>
+              <w:top w:w="80" w:type="dxa"/>
+              <w:left w:w="120" w:type="dxa"/>
+              <w:bottom w:w="80" w:type="dxa"/>
+              <w:right w:w="120" w:type="dxa"/>
+            </w:tcMar>
+          </w:tcPr>
+          <w:p>
+            <w:r>
+              <w:rPr>
+                <w:b/>
+                <w:bCs/>
+              </w:rPr>
+              <w:t>Think. Check. Submit.</w:t>
+            </w:r>
+          </w:p>
+        </w:tc>
+        <w:tc>
+          <w:tcPr>
+            <w:tcW w:w="2300" w:type="dxa"/>
+            <w:tcBorders>
+              <w:top w:val="single" w:sz="4" w:space="0" w:color="B9C9CC"/>
+              <w:left w:val="single" w:sz="4" w:space="0" w:color="B9C9CC"/>
+              <w:bottom w:val="single" w:sz="4" w:space="0" w:color="B9C9CC"/>
+              <w:right w:val="single" w:sz="4" w:space="0" w:color="B9C9CC"/>
+            </w:tcBorders>
+            <w:tcMar>
+              <w:top w:w="80" w:type="dxa"/>
+              <w:left w:w="120" w:type="dxa"/>
+              <w:bottom w:w="80" w:type="dxa"/>
+              <w:right w:w="120" w:type="dxa"/>
+            </w:tcMar>
+          </w:tcPr>
+          <w:p>
+            <w:r>
+              <w:t>thinkchecksubmit.org</w:t>
+            </w:r>
+          </w:p>
+        </w:tc>
+        <w:tc>
+          <w:tcPr>
+            <w:tcW w:w="3838" w:type="dxa"/>
+            <w:tcBorders>
+              <w:top w:val="single" w:sz="4" w:space="0" w:color="B9C9CC"/>
+              <w:left w:val="single" w:sz="4" w:space="0" w:color="B9C9CC"/>
+              <w:bottom w:val="single" w:sz="4" w:space="0" w:color="B9C9CC"/>
+              <w:right w:val="single" w:sz="4" w:space="0" w:color="B9C9CC"/>
+            </w:tcBorders>
+            <w:tcMar>
+              <w:top w:w="80" w:type="dxa"/>
+              <w:left w:w="120" w:type="dxa"/>
+              <w:bottom w:w="80" w:type="dxa"/>
+              <w:right w:w="120" w:type="dxa"/>
+            </w:tcMar>
+          </w:tcPr>
+          <w:p>
+            <w:r>
+              <w:t>Grille pour repérer une revue prédatrice avant de lire, citer ou soumettre.</w:t>
+            </w:r>
+          </w:p>
+        </w:tc>
+        <w:tc>
+          <w:tcPr>
+            <w:tcW w:w="1500" w:type="dxa"/>
+            <w:tcBorders>
+              <w:top w:val="single" w:sz="4" w:space="0" w:color="B9C9CC"/>
+              <w:left w:val="single" w:sz="4" w:space="0" w:color="B9C9CC"/>
+              <w:bottom w:val="single" w:sz="4" w:space="0" w:color="B9C9CC"/>
+              <w:right w:val="single" w:sz="4" w:space="0" w:color="B9C9CC"/>
+            </w:tcBorders>
+            <w:tcMar>
+              <w:top w:w="80" w:type="dxa"/>
+              <w:left w:w="120" w:type="dxa"/>
+              <w:bottom w:w="80" w:type="dxa"/>
+              <w:right w:w="120" w:type="dxa"/>
+            </w:tcMar>
+          </w:tcPr>
+          <w:p>
+            <w:r>
+              <w:t>Gratuit</w:t>
+            </w:r>
+          </w:p>
+        </w:tc>
+      </w:tr>
+      <w:tr>
+        <w:tblPrEx>
+          <w:tblCellMar>
+            <w:top w:w="0" w:type="dxa"/>
+            <w:bottom w:w="0" w:type="dxa"/>
+          </w:tblCellMar>
+        </w:tblPrEx>
+        <w:trPr>
+          <w:cantSplit/>
+        </w:trPr>
+        <w:tc>
+          <w:tcPr>
+            <w:tcW w:w="2000" w:type="dxa"/>
+            <w:tcBorders>
+              <w:top w:val="single" w:sz="4" w:space="0" w:color="B9C9CC"/>
+              <w:left w:val="single" w:sz="4" w:space="0" w:color="B9C9CC"/>
+              <w:bottom w:val="single" w:sz="4" w:space="0" w:color="B9C9CC"/>
+              <w:right w:val="single" w:sz="4" w:space="0" w:color="B9C9CC"/>
+            </w:tcBorders>
+            <w:shd w:val="clear" w:color="auto" w:fill="EAF3F2"/>
+            <w:tcMar>
+              <w:top w:w="80" w:type="dxa"/>
+              <w:left w:w="120" w:type="dxa"/>
+              <w:bottom w:w="80" w:type="dxa"/>
+              <w:right w:w="120" w:type="dxa"/>
+            </w:tcMar>
+          </w:tcPr>
+          <w:p>
+            <w:r>
+              <w:rPr>
+                <w:b/>
+                <w:bCs/>
+              </w:rPr>
               <w:t>OpenAlex</w:t>
             </w:r>
           </w:p>
@@ -15660,6 +19177,7 @@
         <w:pageBreakBefore/>
       </w:pPr>
       <w:r>
+        <w:lastRenderedPageBreak/>
         <w:t>Annexe 3 · Vidéothèque</w:t>
       </w:r>
     </w:p>
@@ -17273,6 +20791,7 @@
                 <w:b/>
                 <w:bCs/>
               </w:rPr>
+              <w:lastRenderedPageBreak/>
               <w:t>J'ai testé Elicit pour ma revue de littérature</w:t>
             </w:r>
           </w:p>
@@ -18814,6 +22333,7 @@
         <w:pStyle w:val="Titre2"/>
       </w:pPr>
       <w:r>
+        <w:lastRenderedPageBreak/>
         <w:t>IA agentique (T5)</w:t>
       </w:r>
     </w:p>
@@ -19301,6 +22821,7 @@
         <w:pageBreakBefore/>
       </w:pPr>
       <w:r>
+        <w:lastRenderedPageBreak/>
         <w:t>Annexe 4 · Bibliothèque de prompts</w:t>
       </w:r>
     </w:p>
@@ -19541,6 +23062,53 @@
         <w:pStyle w:val="Titre2"/>
       </w:pPr>
       <w:r>
+        <w:t>Sujet et gaps</w:t>
+      </w:r>
+    </w:p>
+    <w:p>
+      <w:r>
+        <w:rPr>
+          <w:rFonts w:ascii="Consolas" w:eastAsia="Consolas" w:hAnsi="Consolas" w:cs="Consolas"/>
+        </w:rPr>
+        <w:t>« En te limitant aux sources, liste toutes les limites et pistes de recherche futures énoncées par les auteurs. Cite chaque passage avec sa page. »</w:t>
+      </w:r>
+    </w:p>
+    <w:p>
+      <w:pPr>
+        <w:spacing w:after="60"/>
+      </w:pPr>
+    </w:p>
+    <w:p>
+      <w:r>
+        <w:rPr>
+          <w:rFonts w:ascii="Consolas" w:eastAsia="Consolas" w:hAnsi="Consolas" w:cs="Consolas"/>
+        </w:rPr>
+        <w:t>« À partir de ce tableau [pays, population, méthode, théorie] de mes articles, quelles combinaisons n'apparaissent dans aucun article ? N'invente aucun article. »</w:t>
+      </w:r>
+    </w:p>
+    <w:p>
+      <w:pPr>
+        <w:spacing w:after="60"/>
+      </w:pPr>
+    </w:p>
+    <w:p>
+      <w:r>
+        <w:rPr>
+          <w:rFonts w:ascii="Consolas" w:eastAsia="Consolas" w:hAnsi="Consolas" w:cs="Consolas"/>
+        </w:rPr>
+        <w:t>« Voici ma question de recherche : [question]. Joue un jury sceptique : pourquoi n'est-elle pas originale, pas faisable ou pas pertinente ? Donne 3 objections. »</w:t>
+      </w:r>
+    </w:p>
+    <w:p>
+      <w:pPr>
+        <w:spacing w:after="60"/>
+      </w:pPr>
+    </w:p>
+    <w:p>
+      <w:pPr>
+        <w:pStyle w:val="Titre2"/>
+      </w:pPr>
+      <w:r>
         <w:t>Recherche documentaire</w:t>
       </w:r>
     </w:p>
@@ -19761,10 +23329,10 @@
 <file path=word/numbering.xml><?xml version="1.0" encoding="utf-8"?>
 <w:numbering xmlns:wpc="http://schemas.microsoft.com/office/word/2010/wordprocessingCanvas" xmlns:cx="http://schemas.microsoft.com/office/drawing/2014/chartex" xmlns:cx1="http://schemas.microsoft.com/office/drawing/2015/9/8/chartex" xmlns:cx2="http://schemas.microsoft.com/office/drawing/2015/10/21/chartex" xmlns:cx3="http://schemas.microsoft.com/office/drawing/2016/5/9/chartex" xmlns:cx4="http://schemas.microsoft.com/office/drawing/2016/5/10/chartex" xmlns:cx5="http://schemas.microsoft.com/office/drawing/2016/5/11/chartex" xmlns:cx6="http://schemas.microsoft.com/office/drawing/2016/5/12/chartex" xmlns:cx7="http://schemas.microsoft.com/office/drawing/2016/5/13/chartex" xmlns:cx8="http://schemas.microsoft.com/office/drawing/2016/5/14/chartex" xmlns:mc="http://schemas.openxmlformats.org/markup-compatibility/2006" xmlns:aink="http://schemas.microsoft.com/office/drawing/2016/ink" xmlns:am3d="http://schemas.microsoft.com/office/drawing/2017/model3d" xmlns:o="urn:schemas-microsoft-com:office:office" xmlns:oel="http://schemas.microsoft.com/office/2019/extlst" xmlns:r="http://schemas.openxmlformats.org/officeDocument/2006/relationships" xmlns:m="http://schemas.openxmlformats.org/officeDocument/2006/math" xmlns:v="urn:schemas-microsoft-com:vml" xmlns:wp14="http://schemas.microsoft.com/office/word/2010/wordprocessingDrawing" xmlns:wp="http://schemas.openxmlformats.org/drawingml/2006/wordprocessingDrawing" xmlns:w10="urn:schemas-microsoft-com:office:word" xmlns:w="http://schemas.openxmlformats.org/wordprocessingml/2006/main" xmlns:w14="http://schemas.microsoft.com/office/word/2010/wordml" xmlns:w15="http://schemas.microsoft.com/office/word/2012/wordml" xmlns:w16cex="http://schemas.microsoft.com/office/word/2018/wordml/cex" xmlns:w16cid="http://schemas.microsoft.com/office/word/2016/wordml/cid" xmlns:w16="http://schemas.microsoft.com/office/word/2018/wordml" xmlns:w16du="http://schemas.microsoft.com/office/word/2023/wordml/word16du" xmlns:w16sdtdh="http://schemas.microsoft.com/office/word/2020/wordml/sdtdatahash" xmlns:w16sdtfl="http://schemas.microsoft.com/office/word/2024/wordml/sdtformatlock" xmlns:w16se="http://schemas.microsoft.com/office/word/2015/wordml/symex" xmlns:wpg="http://schemas.microsoft.com/office/word/2010/wordprocessingGroup" xmlns:wpi="http://schemas.microsoft.com/office/word/2010/wordprocessingInk" xmlns:wne="http://schemas.microsoft.com/office/word/2006/wordml" xmlns:wps="http://schemas.microsoft.com/office/word/2010/wordprocessingShape" mc:Ignorable="w14 w15 w16se w16cid w16 w16cex w16sdtdh w16sdtfl w16du wp14">
   <w:abstractNum w:abstractNumId="0" w15:restartNumberingAfterBreak="0">
-    <w:nsid w:val="03DB0F5F"/>
+    <w:nsid w:val="0F527CA6"/>
     <w:multiLevelType w:val="hybridMultilevel"/>
-    <w:tmpl w:val="CC34755C"/>
-    <w:lvl w:ilvl="0" w:tplc="B8C02962">
+    <w:tmpl w:val="88EE7D14"/>
+    <w:lvl w:ilvl="0" w:tplc="E8162EE4">
       <w:start w:val="1"/>
       <w:numFmt w:val="decimal"/>
       <w:lvlText w:val="%1."/>
@@ -19773,52 +23341,52 @@
         <w:ind w:left="540" w:hanging="300"/>
       </w:pPr>
     </w:lvl>
-    <w:lvl w:ilvl="1" w:tplc="0A081D8A">
+    <w:lvl w:ilvl="1" w:tplc="6200ED76">
       <w:numFmt w:val="decimal"/>
       <w:lvlText w:val=""/>
       <w:lvlJc w:val="left"/>
     </w:lvl>
-    <w:lvl w:ilvl="2" w:tplc="78F60E4A">
+    <w:lvl w:ilvl="2" w:tplc="79BC9D74">
       <w:numFmt w:val="decimal"/>
       <w:lvlText w:val=""/>
       <w:lvlJc w:val="left"/>
     </w:lvl>
-    <w:lvl w:ilvl="3" w:tplc="79AE76E4">
+    <w:lvl w:ilvl="3" w:tplc="06762CBC">
       <w:numFmt w:val="decimal"/>
       <w:lvlText w:val=""/>
       <w:lvlJc w:val="left"/>
     </w:lvl>
-    <w:lvl w:ilvl="4" w:tplc="7486CE9A">
+    <w:lvl w:ilvl="4" w:tplc="9140BE58">
       <w:numFmt w:val="decimal"/>
       <w:lvlText w:val=""/>
       <w:lvlJc w:val="left"/>
     </w:lvl>
-    <w:lvl w:ilvl="5" w:tplc="80469C4A">
+    <w:lvl w:ilvl="5" w:tplc="BC34C792">
       <w:numFmt w:val="decimal"/>
       <w:lvlText w:val=""/>
       <w:lvlJc w:val="left"/>
     </w:lvl>
-    <w:lvl w:ilvl="6" w:tplc="494C666E">
+    <w:lvl w:ilvl="6" w:tplc="DAB00DD0">
       <w:numFmt w:val="decimal"/>
       <w:lvlText w:val=""/>
       <w:lvlJc w:val="left"/>
     </w:lvl>
-    <w:lvl w:ilvl="7" w:tplc="2AE60866">
+    <w:lvl w:ilvl="7" w:tplc="626E865A">
       <w:numFmt w:val="decimal"/>
       <w:lvlText w:val=""/>
       <w:lvlJc w:val="left"/>
     </w:lvl>
-    <w:lvl w:ilvl="8" w:tplc="89504DE0">
+    <w:lvl w:ilvl="8" w:tplc="9ED49626">
       <w:numFmt w:val="decimal"/>
       <w:lvlText w:val=""/>
       <w:lvlJc w:val="left"/>
     </w:lvl>
   </w:abstractNum>
   <w:abstractNum w:abstractNumId="1" w15:restartNumberingAfterBreak="0">
-    <w:nsid w:val="63230C8D"/>
+    <w:nsid w:val="1A3763FD"/>
     <w:multiLevelType w:val="hybridMultilevel"/>
-    <w:tmpl w:val="B25AA872"/>
-    <w:lvl w:ilvl="0" w:tplc="9F38C4CA">
+    <w:tmpl w:val="60E4A490"/>
+    <w:lvl w:ilvl="0" w:tplc="A9B0720A">
       <w:start w:val="1"/>
       <w:numFmt w:val="bullet"/>
       <w:lvlText w:val="●"/>
@@ -19827,7 +23395,7 @@
         <w:ind w:left="720" w:hanging="360"/>
       </w:pPr>
     </w:lvl>
-    <w:lvl w:ilvl="1" w:tplc="10CA94F6">
+    <w:lvl w:ilvl="1" w:tplc="60A299BA">
       <w:start w:val="1"/>
       <w:numFmt w:val="bullet"/>
       <w:lvlText w:val="○"/>
@@ -19836,7 +23404,7 @@
         <w:ind w:left="1440" w:hanging="360"/>
       </w:pPr>
     </w:lvl>
-    <w:lvl w:ilvl="2" w:tplc="3C366EEA">
+    <w:lvl w:ilvl="2" w:tplc="F9802BD6">
       <w:start w:val="1"/>
       <w:numFmt w:val="bullet"/>
       <w:lvlText w:val="■"/>
@@ -19845,7 +23413,7 @@
         <w:ind w:left="2160" w:hanging="360"/>
       </w:pPr>
     </w:lvl>
-    <w:lvl w:ilvl="3" w:tplc="A5924448">
+    <w:lvl w:ilvl="3" w:tplc="27AEB3D2">
       <w:start w:val="1"/>
       <w:numFmt w:val="bullet"/>
       <w:lvlText w:val="●"/>
@@ -19854,7 +23422,7 @@
         <w:ind w:left="2880" w:hanging="360"/>
       </w:pPr>
     </w:lvl>
-    <w:lvl w:ilvl="4" w:tplc="08C49078">
+    <w:lvl w:ilvl="4" w:tplc="0D8ACE40">
       <w:start w:val="1"/>
       <w:numFmt w:val="bullet"/>
       <w:lvlText w:val="○"/>
@@ -19863,7 +23431,7 @@
         <w:ind w:left="3600" w:hanging="360"/>
       </w:pPr>
     </w:lvl>
-    <w:lvl w:ilvl="5" w:tplc="CBC00DBC">
+    <w:lvl w:ilvl="5" w:tplc="E4F07D66">
       <w:start w:val="1"/>
       <w:numFmt w:val="bullet"/>
       <w:lvlText w:val="■"/>
@@ -19872,7 +23440,7 @@
         <w:ind w:left="4320" w:hanging="360"/>
       </w:pPr>
     </w:lvl>
-    <w:lvl w:ilvl="6" w:tplc="4E50E016">
+    <w:lvl w:ilvl="6" w:tplc="1570CA9A">
       <w:start w:val="1"/>
       <w:numFmt w:val="bullet"/>
       <w:lvlText w:val="●"/>
@@ -19881,7 +23449,7 @@
         <w:ind w:left="5040" w:hanging="360"/>
       </w:pPr>
     </w:lvl>
-    <w:lvl w:ilvl="7" w:tplc="661EFA26">
+    <w:lvl w:ilvl="7" w:tplc="34AACA56">
       <w:start w:val="1"/>
       <w:numFmt w:val="bullet"/>
       <w:lvlText w:val="●"/>
@@ -19890,7 +23458,7 @@
         <w:ind w:left="5760" w:hanging="360"/>
       </w:pPr>
     </w:lvl>
-    <w:lvl w:ilvl="8" w:tplc="4BE4C86C">
+    <w:lvl w:ilvl="8" w:tplc="FA788AEC">
       <w:start w:val="1"/>
       <w:numFmt w:val="bullet"/>
       <w:lvlText w:val="●"/>
@@ -19901,10 +23469,10 @@
     </w:lvl>
   </w:abstractNum>
   <w:abstractNum w:abstractNumId="2" w15:restartNumberingAfterBreak="0">
-    <w:nsid w:val="65816497"/>
+    <w:nsid w:val="4E165ADC"/>
     <w:multiLevelType w:val="hybridMultilevel"/>
-    <w:tmpl w:val="852A42AC"/>
-    <w:lvl w:ilvl="0" w:tplc="1348254A">
+    <w:tmpl w:val="D4F2E9AC"/>
+    <w:lvl w:ilvl="0" w:tplc="02528466">
       <w:start w:val="1"/>
       <w:numFmt w:val="bullet"/>
       <w:lvlText w:val="•"/>
@@ -19913,102 +23481,108 @@
         <w:ind w:left="540" w:hanging="270"/>
       </w:pPr>
     </w:lvl>
-    <w:lvl w:ilvl="1" w:tplc="0B96F990">
+    <w:lvl w:ilvl="1" w:tplc="C2C23604">
       <w:numFmt w:val="decimal"/>
       <w:lvlText w:val=""/>
       <w:lvlJc w:val="left"/>
     </w:lvl>
-    <w:lvl w:ilvl="2" w:tplc="C69CD8FE">
+    <w:lvl w:ilvl="2" w:tplc="BBC2B7D4">
       <w:numFmt w:val="decimal"/>
       <w:lvlText w:val=""/>
       <w:lvlJc w:val="left"/>
     </w:lvl>
-    <w:lvl w:ilvl="3" w:tplc="1DD6E2F0">
+    <w:lvl w:ilvl="3" w:tplc="B0C63054">
       <w:numFmt w:val="decimal"/>
       <w:lvlText w:val=""/>
       <w:lvlJc w:val="left"/>
     </w:lvl>
-    <w:lvl w:ilvl="4" w:tplc="8BEA1F66">
+    <w:lvl w:ilvl="4" w:tplc="73C02186">
       <w:numFmt w:val="decimal"/>
       <w:lvlText w:val=""/>
       <w:lvlJc w:val="left"/>
     </w:lvl>
-    <w:lvl w:ilvl="5" w:tplc="EF2E49D4">
+    <w:lvl w:ilvl="5" w:tplc="8B9C570A">
       <w:numFmt w:val="decimal"/>
       <w:lvlText w:val=""/>
       <w:lvlJc w:val="left"/>
     </w:lvl>
-    <w:lvl w:ilvl="6" w:tplc="E088648C">
+    <w:lvl w:ilvl="6" w:tplc="7B2E0894">
       <w:numFmt w:val="decimal"/>
       <w:lvlText w:val=""/>
       <w:lvlJc w:val="left"/>
     </w:lvl>
-    <w:lvl w:ilvl="7" w:tplc="CA220DAC">
+    <w:lvl w:ilvl="7" w:tplc="54F22EE6">
       <w:numFmt w:val="decimal"/>
       <w:lvlText w:val=""/>
       <w:lvlJc w:val="left"/>
     </w:lvl>
-    <w:lvl w:ilvl="8" w:tplc="E006FF3A">
+    <w:lvl w:ilvl="8" w:tplc="A934BBF4">
       <w:numFmt w:val="decimal"/>
       <w:lvlText w:val=""/>
       <w:lvlJc w:val="left"/>
     </w:lvl>
   </w:abstractNum>
-  <w:num w:numId="1" w16cid:durableId="1139154252">
+  <w:num w:numId="1" w16cid:durableId="2029721674">
     <w:abstractNumId w:val="1"/>
     <w:lvlOverride w:ilvl="0">
       <w:startOverride w:val="1"/>
     </w:lvlOverride>
   </w:num>
-  <w:num w:numId="2" w16cid:durableId="64645976">
+  <w:num w:numId="2" w16cid:durableId="101537764">
     <w:abstractNumId w:val="2"/>
     <w:lvlOverride w:ilvl="0">
       <w:startOverride w:val="1"/>
     </w:lvlOverride>
   </w:num>
-  <w:num w:numId="3" w16cid:durableId="2052655937">
+  <w:num w:numId="3" w16cid:durableId="894851116">
     <w:abstractNumId w:val="0"/>
     <w:lvlOverride w:ilvl="0">
       <w:startOverride w:val="1"/>
     </w:lvlOverride>
   </w:num>
-  <w:num w:numId="4" w16cid:durableId="1289050215">
+  <w:num w:numId="4" w16cid:durableId="86388593">
     <w:abstractNumId w:val="0"/>
     <w:lvlOverride w:ilvl="0">
       <w:startOverride w:val="1"/>
     </w:lvlOverride>
   </w:num>
-  <w:num w:numId="5" w16cid:durableId="1674379752">
+  <w:num w:numId="5" w16cid:durableId="883103721">
     <w:abstractNumId w:val="0"/>
     <w:lvlOverride w:ilvl="0">
       <w:startOverride w:val="1"/>
     </w:lvlOverride>
   </w:num>
-  <w:num w:numId="6" w16cid:durableId="2019773612">
+  <w:num w:numId="6" w16cid:durableId="2069037966">
     <w:abstractNumId w:val="0"/>
     <w:lvlOverride w:ilvl="0">
       <w:startOverride w:val="1"/>
     </w:lvlOverride>
   </w:num>
-  <w:num w:numId="7" w16cid:durableId="1460949794">
+  <w:num w:numId="7" w16cid:durableId="839468811">
     <w:abstractNumId w:val="0"/>
     <w:lvlOverride w:ilvl="0">
       <w:startOverride w:val="1"/>
     </w:lvlOverride>
   </w:num>
-  <w:num w:numId="8" w16cid:durableId="1188760425">
+  <w:num w:numId="8" w16cid:durableId="313024099">
     <w:abstractNumId w:val="0"/>
     <w:lvlOverride w:ilvl="0">
       <w:startOverride w:val="1"/>
     </w:lvlOverride>
   </w:num>
-  <w:num w:numId="9" w16cid:durableId="1462845227">
+  <w:num w:numId="9" w16cid:durableId="478107821">
     <w:abstractNumId w:val="0"/>
     <w:lvlOverride w:ilvl="0">
       <w:startOverride w:val="1"/>
     </w:lvlOverride>
   </w:num>
-  <w:num w:numId="10" w16cid:durableId="305090521">
+  <w:num w:numId="10" w16cid:durableId="259610211">
+    <w:abstractNumId w:val="0"/>
+    <w:lvlOverride w:ilvl="0">
+      <w:startOverride w:val="1"/>
+    </w:lvlOverride>
+  </w:num>
+  <w:num w:numId="11" w16cid:durableId="1631202310">
     <w:abstractNumId w:val="0"/>
     <w:lvlOverride w:ilvl="0">
       <w:startOverride w:val="1"/>

</xml_diff>